<commit_message>
resume: stronger Aleph bullets (retention engine shipped to prod, 2.7x targeting catch, integration SDK, prod auth-outage root-cause) + one-line role/company + date/location headers + spacing tuned to fill the page
</commit_message>
<xml_diff>
--- a/apps/resume/dist/Brian_Lee_Resume_Design.docx
+++ b/apps/resume/dist/Brian_Lee_Resume_Design.docx
@@ -4,7 +4,7 @@
   <w:body>
     <w:p>
       <w:pPr>
-        <w:spacing w:before="0" w:after="20" w:line="212" w:lineRule="auto"/>
+        <w:spacing w:before="0" w:after="20" w:line="220" w:lineRule="auto"/>
         <w:jc w:val="center"/>
       </w:pPr>
       <w:r>
@@ -20,7 +20,7 @@
     </w:p>
     <w:p>
       <w:pPr>
-        <w:spacing w:before="0" w:after="40" w:line="212" w:lineRule="auto"/>
+        <w:spacing w:before="0" w:after="40" w:line="220" w:lineRule="auto"/>
         <w:jc w:val="center"/>
       </w:pPr>
       <w:r>
@@ -69,7 +69,7 @@
         <w:pBdr>
           <w:bottom w:val="single" w:sz="6" w:space="1" w:color="000000"/>
         </w:pBdr>
-        <w:spacing w:before="80" w:after="40" w:line="212" w:lineRule="auto"/>
+        <w:spacing w:before="80" w:after="40" w:line="220" w:lineRule="auto"/>
       </w:pPr>
       <w:r>
         <w:rPr>
@@ -89,7 +89,7 @@
         <w:tabs>
           <w:tab w:val="right" w:pos="10944"/>
         </w:tabs>
-        <w:spacing w:before="40" w:after="0" w:line="212" w:lineRule="auto"/>
+        <w:spacing w:before="40" w:after="0" w:line="220" w:lineRule="auto"/>
       </w:pPr>
       <w:r>
         <w:rPr>
@@ -116,7 +116,7 @@
         <w:tabs>
           <w:tab w:val="right" w:pos="10944"/>
         </w:tabs>
-        <w:spacing w:before="0" w:after="0" w:line="212" w:lineRule="auto"/>
+        <w:spacing w:before="0" w:after="0" w:line="220" w:lineRule="auto"/>
       </w:pPr>
       <w:r>
         <w:rPr>
@@ -142,7 +142,7 @@
     </w:p>
     <w:p>
       <w:pPr>
-        <w:spacing w:before="0" w:after="0" w:line="212" w:lineRule="auto"/>
+        <w:spacing w:before="0" w:after="0" w:line="220" w:lineRule="auto"/>
       </w:pPr>
       <w:r>
         <w:rPr>
@@ -168,7 +168,7 @@
         <w:pBdr>
           <w:bottom w:val="single" w:sz="6" w:space="1" w:color="000000"/>
         </w:pBdr>
-        <w:spacing w:before="60" w:after="40" w:line="212" w:lineRule="auto"/>
+        <w:spacing w:before="60" w:after="40" w:line="220" w:lineRule="auto"/>
       </w:pPr>
       <w:r>
         <w:rPr>
@@ -188,7 +188,7 @@
         <w:tabs>
           <w:tab w:val="right" w:pos="10944"/>
         </w:tabs>
-        <w:spacing w:before="60" w:after="0" w:line="212" w:lineRule="auto"/>
+        <w:spacing w:before="100" w:after="0" w:line="220" w:lineRule="auto"/>
       </w:pPr>
       <w:r>
         <w:rPr>
@@ -206,8 +206,88 @@
           <w:sz w:val="21"/>
           <w:szCs w:val="21"/>
         </w:rPr>
+        <w:t xml:space="preserve">, Aleph Lab (Y Combinator)</w:t>
+      </w:r>
+      <w:r>
+        <w:rPr>
+          <w:rFonts w:ascii="Calibri" w:hAnsi="Calibri" w:cs="Calibri"/>
+          <w:sz w:val="20"/>
+          <w:szCs w:val="20"/>
+        </w:rPr>
         <w:tab/>
-        <w:t xml:space="preserve">June 2026 – Present</w:t>
+        <w:t xml:space="preserve">June 2026 – Present  ·  San Francisco (Remote)</w:t>
+      </w:r>
+    </w:p>
+    <w:p>
+      <w:pPr>
+        <w:numPr>
+          <w:ilvl w:val="0"/>
+          <w:numId w:val="1"/>
+        </w:numPr>
+        <w:spacing w:before="0" w:after="0" w:line="220" w:lineRule="auto"/>
+        <w:ind w:left="360" w:hanging="216"/>
+      </w:pPr>
+      <w:r>
+        <w:rPr>
+          <w:rFonts w:ascii="Calibri" w:hAnsi="Calibri" w:cs="Calibri"/>
+          <w:sz w:val="21"/>
+          <w:szCs w:val="21"/>
+        </w:rPr>
+        <w:t xml:space="preserve">Built a deterministic Figma-to-React Native pipeline at a 4-engineer YC startup, turning designs into tokenized Expo components and shipping it as a reusable team skill</w:t>
+      </w:r>
+    </w:p>
+    <w:p>
+      <w:pPr>
+        <w:numPr>
+          <w:ilvl w:val="0"/>
+          <w:numId w:val="1"/>
+        </w:numPr>
+        <w:spacing w:before="0" w:after="0" w:line="220" w:lineRule="auto"/>
+        <w:ind w:left="360" w:hanging="216"/>
+      </w:pPr>
+      <w:r>
+        <w:rPr>
+          <w:rFonts w:ascii="Calibri" w:hAnsi="Calibri" w:cs="Calibri"/>
+          <w:sz w:val="21"/>
+          <w:szCs w:val="21"/>
+        </w:rPr>
+        <w:t xml:space="preserve">Analyzed onboarding-trial data and surfaced a mobile session-entry drop-off (roughly half the desktop activation rate), recommending a pre-session audio gate that reshaped onboarding priorities</w:t>
+      </w:r>
+    </w:p>
+    <w:p>
+      <w:pPr>
+        <w:numPr>
+          <w:ilvl w:val="0"/>
+          <w:numId w:val="1"/>
+        </w:numPr>
+        <w:spacing w:before="0" w:after="0" w:line="220" w:lineRule="auto"/>
+        <w:ind w:left="360" w:hanging="216"/>
+      </w:pPr>
+      <w:r>
+        <w:rPr>
+          <w:rFonts w:ascii="Calibri" w:hAnsi="Calibri" w:cs="Calibri"/>
+          <w:sz w:val="21"/>
+          <w:szCs w:val="21"/>
+        </w:rPr>
+        <w:t xml:space="preserve">Designed declarative mode-authoring tooling (schema + conformance linter) so new AI-character game modes ship as data, not bespoke code</w:t>
+      </w:r>
+    </w:p>
+    <w:p>
+      <w:pPr>
+        <w:numPr>
+          <w:ilvl w:val="0"/>
+          <w:numId w:val="1"/>
+        </w:numPr>
+        <w:spacing w:before="0" w:after="0" w:line="220" w:lineRule="auto"/>
+        <w:ind w:left="360" w:hanging="216"/>
+      </w:pPr>
+      <w:r>
+        <w:rPr>
+          <w:rFonts w:ascii="Calibri" w:hAnsi="Calibri" w:cs="Calibri"/>
+          <w:sz w:val="21"/>
+          <w:szCs w:val="21"/>
+        </w:rPr>
+        <w:t xml:space="preserve">Prototyped child-friendly notification and error-state UX (warm copy, recovery paths, observability) for a kids' English-learning app</w:t>
       </w:r>
     </w:p>
     <w:p>
@@ -215,82 +295,88 @@
         <w:tabs>
           <w:tab w:val="right" w:pos="10944"/>
         </w:tabs>
-        <w:spacing w:before="0" w:after="0" w:line="212" w:lineRule="auto"/>
-      </w:pPr>
-      <w:r>
-        <w:rPr>
-          <w:rFonts w:ascii="Calibri" w:hAnsi="Calibri" w:cs="Calibri"/>
-          <w:i/>
-          <w:iCs/>
-          <w:sz w:val="20"/>
-          <w:szCs w:val="20"/>
-        </w:rPr>
-        <w:t xml:space="preserve">Aleph Lab (Y Combinator)</w:t>
-      </w:r>
-      <w:r>
-        <w:rPr>
-          <w:rFonts w:ascii="Calibri" w:hAnsi="Calibri" w:cs="Calibri"/>
-          <w:i/>
-          <w:iCs/>
+        <w:spacing w:before="100" w:after="0" w:line="220" w:lineRule="auto"/>
+      </w:pPr>
+      <w:r>
+        <w:rPr>
+          <w:rFonts w:ascii="Calibri" w:hAnsi="Calibri" w:cs="Calibri"/>
+          <w:b/>
+          <w:bCs/>
+          <w:sz w:val="21"/>
+          <w:szCs w:val="21"/>
+        </w:rPr>
+        <w:t xml:space="preserve">Software Engineer Intern</w:t>
+      </w:r>
+      <w:r>
+        <w:rPr>
+          <w:rFonts w:ascii="Calibri" w:hAnsi="Calibri" w:cs="Calibri"/>
+          <w:sz w:val="21"/>
+          <w:szCs w:val="21"/>
+        </w:rPr>
+        <w:t xml:space="preserve">, BitMango (Puzzle1 Studio)</w:t>
+      </w:r>
+      <w:r>
+        <w:rPr>
+          <w:rFonts w:ascii="Calibri" w:hAnsi="Calibri" w:cs="Calibri"/>
           <w:sz w:val="20"/>
           <w:szCs w:val="20"/>
         </w:rPr>
         <w:tab/>
-        <w:t xml:space="preserve">San Francisco, CA (Remote)</w:t>
-      </w:r>
-    </w:p>
-    <w:p>
-      <w:pPr>
-        <w:numPr>
-          <w:ilvl w:val="0"/>
-          <w:numId w:val="1"/>
-        </w:numPr>
-        <w:spacing w:before="0" w:after="0" w:line="212" w:lineRule="auto"/>
-        <w:ind w:left="360" w:hanging="216"/>
-      </w:pPr>
-      <w:r>
-        <w:rPr>
-          <w:rFonts w:ascii="Calibri" w:hAnsi="Calibri" w:cs="Calibri"/>
-          <w:sz w:val="21"/>
-          <w:szCs w:val="21"/>
-        </w:rPr>
-        <w:t xml:space="preserve">Built a deterministic Figma-to-React Native pipeline at a 4-engineer YC startup, turning designs into tokenized Expo components in-house</w:t>
-      </w:r>
-    </w:p>
-    <w:p>
-      <w:pPr>
-        <w:numPr>
-          <w:ilvl w:val="0"/>
-          <w:numId w:val="1"/>
-        </w:numPr>
-        <w:spacing w:before="0" w:after="0" w:line="212" w:lineRule="auto"/>
-        <w:ind w:left="360" w:hanging="216"/>
-      </w:pPr>
-      <w:r>
-        <w:rPr>
-          <w:rFonts w:ascii="Calibri" w:hAnsi="Calibri" w:cs="Calibri"/>
-          <w:sz w:val="21"/>
-          <w:szCs w:val="21"/>
-        </w:rPr>
-        <w:t xml:space="preserve">Designed declarative mode-authoring tooling (schema + conformance linter) so new AI-character game modes ship as data, not bespoke code</w:t>
-      </w:r>
-    </w:p>
-    <w:p>
-      <w:pPr>
-        <w:numPr>
-          <w:ilvl w:val="0"/>
-          <w:numId w:val="1"/>
-        </w:numPr>
-        <w:spacing w:before="0" w:after="0" w:line="212" w:lineRule="auto"/>
-        <w:ind w:left="360" w:hanging="216"/>
-      </w:pPr>
-      <w:r>
-        <w:rPr>
-          <w:rFonts w:ascii="Calibri" w:hAnsi="Calibri" w:cs="Calibri"/>
-          <w:sz w:val="21"/>
-          <w:szCs w:val="21"/>
-        </w:rPr>
-        <w:t xml:space="preserve">Prototyped child-friendly notification and error-state UX (warm copy, recovery paths, observability) for a kids' English-learning app</w:t>
+        <w:t xml:space="preserve">June 2025 – Aug 2025  ·  Pangyo, South Korea</w:t>
+      </w:r>
+    </w:p>
+    <w:p>
+      <w:pPr>
+        <w:numPr>
+          <w:ilvl w:val="0"/>
+          <w:numId w:val="1"/>
+        </w:numPr>
+        <w:spacing w:before="0" w:after="0" w:line="220" w:lineRule="auto"/>
+        <w:ind w:left="360" w:hanging="216"/>
+      </w:pPr>
+      <w:r>
+        <w:rPr>
+          <w:rFonts w:ascii="Calibri" w:hAnsi="Calibri" w:cs="Calibri"/>
+          <w:sz w:val="21"/>
+          <w:szCs w:val="21"/>
+        </w:rPr>
+        <w:t xml:space="preserve">Maintained a live portfolio of 50+ Unity mobile game titles, improving UI/UX and core gameplay stability across deployments</w:t>
+      </w:r>
+    </w:p>
+    <w:p>
+      <w:pPr>
+        <w:numPr>
+          <w:ilvl w:val="0"/>
+          <w:numId w:val="1"/>
+        </w:numPr>
+        <w:spacing w:before="0" w:after="0" w:line="220" w:lineRule="auto"/>
+        <w:ind w:left="360" w:hanging="216"/>
+      </w:pPr>
+      <w:r>
+        <w:rPr>
+          <w:rFonts w:ascii="Calibri" w:hAnsi="Calibri" w:cs="Calibri"/>
+          <w:sz w:val="21"/>
+          <w:szCs w:val="21"/>
+        </w:rPr>
+        <w:t xml:space="preserve">Resolved 100+ QA-reported bugs by modifying Unity prefabs and C# scripts, shipping fixes in production releases</w:t>
+      </w:r>
+    </w:p>
+    <w:p>
+      <w:pPr>
+        <w:numPr>
+          <w:ilvl w:val="0"/>
+          <w:numId w:val="1"/>
+        </w:numPr>
+        <w:spacing w:before="0" w:after="0" w:line="220" w:lineRule="auto"/>
+        <w:ind w:left="360" w:hanging="216"/>
+      </w:pPr>
+      <w:r>
+        <w:rPr>
+          <w:rFonts w:ascii="Calibri" w:hAnsi="Calibri" w:cs="Calibri"/>
+          <w:sz w:val="21"/>
+          <w:szCs w:val="21"/>
+        </w:rPr>
+        <w:t xml:space="preserve">Upgraded SDKs and platform modules fleet-wide to meet evolving app-store requirements and sustain production availability</w:t>
       </w:r>
     </w:p>
     <w:p>
@@ -298,26 +384,88 @@
         <w:tabs>
           <w:tab w:val="right" w:pos="10944"/>
         </w:tabs>
-        <w:spacing w:before="60" w:after="0" w:line="212" w:lineRule="auto"/>
-      </w:pPr>
-      <w:r>
-        <w:rPr>
-          <w:rFonts w:ascii="Calibri" w:hAnsi="Calibri" w:cs="Calibri"/>
-          <w:b/>
-          <w:bCs/>
-          <w:sz w:val="21"/>
-          <w:szCs w:val="21"/>
-        </w:rPr>
-        <w:t xml:space="preserve">Software Engineer Intern</w:t>
-      </w:r>
-      <w:r>
-        <w:rPr>
-          <w:rFonts w:ascii="Calibri" w:hAnsi="Calibri" w:cs="Calibri"/>
-          <w:sz w:val="21"/>
-          <w:szCs w:val="21"/>
+        <w:spacing w:before="100" w:after="0" w:line="220" w:lineRule="auto"/>
+      </w:pPr>
+      <w:r>
+        <w:rPr>
+          <w:rFonts w:ascii="Calibri" w:hAnsi="Calibri" w:cs="Calibri"/>
+          <w:b/>
+          <w:bCs/>
+          <w:sz w:val="21"/>
+          <w:szCs w:val="21"/>
+        </w:rPr>
+        <w:t xml:space="preserve">Project Lead &amp; Product Designer</w:t>
+      </w:r>
+      <w:r>
+        <w:rPr>
+          <w:rFonts w:ascii="Calibri" w:hAnsi="Calibri" w:cs="Calibri"/>
+          <w:sz w:val="21"/>
+          <w:szCs w:val="21"/>
+        </w:rPr>
+        <w:t xml:space="preserve">, Penn Spark (Red Team)</w:t>
+      </w:r>
+      <w:r>
+        <w:rPr>
+          <w:rFonts w:ascii="Calibri" w:hAnsi="Calibri" w:cs="Calibri"/>
+          <w:sz w:val="20"/>
+          <w:szCs w:val="20"/>
         </w:rPr>
         <w:tab/>
-        <w:t xml:space="preserve">June 2025 – Aug 2025</w:t>
+        <w:t xml:space="preserve">Jan 2025 – Present  ·  Philadelphia, PA</w:t>
+      </w:r>
+    </w:p>
+    <w:p>
+      <w:pPr>
+        <w:numPr>
+          <w:ilvl w:val="0"/>
+          <w:numId w:val="1"/>
+        </w:numPr>
+        <w:spacing w:before="0" w:after="0" w:line="220" w:lineRule="auto"/>
+        <w:ind w:left="360" w:hanging="216"/>
+      </w:pPr>
+      <w:r>
+        <w:rPr>
+          <w:rFonts w:ascii="Calibri" w:hAnsi="Calibri" w:cs="Calibri"/>
+          <w:sz w:val="21"/>
+          <w:szCs w:val="21"/>
+        </w:rPr>
+        <w:t xml:space="preserve">Led a 15+-person cross-functional team of designers and developers to ship client-facing 0-to-1 products</w:t>
+      </w:r>
+    </w:p>
+    <w:p>
+      <w:pPr>
+        <w:numPr>
+          <w:ilvl w:val="0"/>
+          <w:numId w:val="1"/>
+        </w:numPr>
+        <w:spacing w:before="0" w:after="0" w:line="220" w:lineRule="auto"/>
+        <w:ind w:left="360" w:hanging="216"/>
+      </w:pPr>
+      <w:r>
+        <w:rPr>
+          <w:rFonts w:ascii="Calibri" w:hAnsi="Calibri" w:cs="Calibri"/>
+          <w:sz w:val="21"/>
+          <w:szCs w:val="21"/>
+        </w:rPr>
+        <w:t xml:space="preserve">Defined end-to-end user flows, interaction patterns, and reusable interface systems across multiple deliverables</w:t>
+      </w:r>
+    </w:p>
+    <w:p>
+      <w:pPr>
+        <w:numPr>
+          <w:ilvl w:val="0"/>
+          <w:numId w:val="1"/>
+        </w:numPr>
+        <w:spacing w:before="0" w:after="0" w:line="220" w:lineRule="auto"/>
+        <w:ind w:left="360" w:hanging="216"/>
+      </w:pPr>
+      <w:r>
+        <w:rPr>
+          <w:rFonts w:ascii="Calibri" w:hAnsi="Calibri" w:cs="Calibri"/>
+          <w:sz w:val="21"/>
+          <w:szCs w:val="21"/>
+        </w:rPr>
+        <w:t xml:space="preserve">Shipped polished, user-centered features across semester-long client project cycles</w:t>
       </w:r>
     </w:p>
     <w:p>
@@ -325,82 +473,70 @@
         <w:tabs>
           <w:tab w:val="right" w:pos="10944"/>
         </w:tabs>
-        <w:spacing w:before="0" w:after="0" w:line="212" w:lineRule="auto"/>
-      </w:pPr>
-      <w:r>
-        <w:rPr>
-          <w:rFonts w:ascii="Calibri" w:hAnsi="Calibri" w:cs="Calibri"/>
-          <w:i/>
-          <w:iCs/>
-          <w:sz w:val="20"/>
-          <w:szCs w:val="20"/>
-        </w:rPr>
-        <w:t xml:space="preserve">BitMango (Puzzle1 Studio)</w:t>
-      </w:r>
-      <w:r>
-        <w:rPr>
-          <w:rFonts w:ascii="Calibri" w:hAnsi="Calibri" w:cs="Calibri"/>
-          <w:i/>
-          <w:iCs/>
+        <w:spacing w:before="100" w:after="0" w:line="220" w:lineRule="auto"/>
+      </w:pPr>
+      <w:r>
+        <w:rPr>
+          <w:rFonts w:ascii="Calibri" w:hAnsi="Calibri" w:cs="Calibri"/>
+          <w:b/>
+          <w:bCs/>
+          <w:sz w:val="21"/>
+          <w:szCs w:val="21"/>
+        </w:rPr>
+        <w:t xml:space="preserve">Military Interpreter</w:t>
+      </w:r>
+      <w:r>
+        <w:rPr>
+          <w:rFonts w:ascii="Calibri" w:hAnsi="Calibri" w:cs="Calibri"/>
+          <w:sz w:val="21"/>
+          <w:szCs w:val="21"/>
+        </w:rPr>
+        <w:t xml:space="preserve">, Capital Defense Command (ROK Army)</w:t>
+      </w:r>
+      <w:r>
+        <w:rPr>
+          <w:rFonts w:ascii="Calibri" w:hAnsi="Calibri" w:cs="Calibri"/>
           <w:sz w:val="20"/>
           <w:szCs w:val="20"/>
         </w:rPr>
         <w:tab/>
-        <w:t xml:space="preserve">Pangyo, South Korea</w:t>
-      </w:r>
-    </w:p>
-    <w:p>
-      <w:pPr>
-        <w:numPr>
-          <w:ilvl w:val="0"/>
-          <w:numId w:val="1"/>
-        </w:numPr>
-        <w:spacing w:before="0" w:after="0" w:line="212" w:lineRule="auto"/>
-        <w:ind w:left="360" w:hanging="216"/>
-      </w:pPr>
-      <w:r>
-        <w:rPr>
-          <w:rFonts w:ascii="Calibri" w:hAnsi="Calibri" w:cs="Calibri"/>
-          <w:sz w:val="21"/>
-          <w:szCs w:val="21"/>
-        </w:rPr>
-        <w:t xml:space="preserve">Maintained a live portfolio of 50+ Unity mobile game titles, improving UI/UX and core gameplay stability across deployments</w:t>
-      </w:r>
-    </w:p>
-    <w:p>
-      <w:pPr>
-        <w:numPr>
-          <w:ilvl w:val="0"/>
-          <w:numId w:val="1"/>
-        </w:numPr>
-        <w:spacing w:before="0" w:after="0" w:line="212" w:lineRule="auto"/>
-        <w:ind w:left="360" w:hanging="216"/>
-      </w:pPr>
-      <w:r>
-        <w:rPr>
-          <w:rFonts w:ascii="Calibri" w:hAnsi="Calibri" w:cs="Calibri"/>
-          <w:sz w:val="21"/>
-          <w:szCs w:val="21"/>
-        </w:rPr>
-        <w:t xml:space="preserve">Resolved 100+ QA-reported bugs by modifying Unity prefabs and C# scripts, shipping fixes in production releases</w:t>
-      </w:r>
-    </w:p>
-    <w:p>
-      <w:pPr>
-        <w:numPr>
-          <w:ilvl w:val="0"/>
-          <w:numId w:val="1"/>
-        </w:numPr>
-        <w:spacing w:before="0" w:after="0" w:line="212" w:lineRule="auto"/>
-        <w:ind w:left="360" w:hanging="216"/>
-      </w:pPr>
-      <w:r>
-        <w:rPr>
-          <w:rFonts w:ascii="Calibri" w:hAnsi="Calibri" w:cs="Calibri"/>
-          <w:sz w:val="21"/>
-          <w:szCs w:val="21"/>
-        </w:rPr>
-        <w:t xml:space="preserve">Upgraded SDKs and platform modules fleet-wide to meet evolving app-store requirements and sustain production availability</w:t>
+        <w:t xml:space="preserve">Dec 2022 – June 2024  ·  Seoul, South Korea</w:t>
+      </w:r>
+    </w:p>
+    <w:p>
+      <w:pPr>
+        <w:numPr>
+          <w:ilvl w:val="0"/>
+          <w:numId w:val="1"/>
+        </w:numPr>
+        <w:spacing w:before="0" w:after="0" w:line="220" w:lineRule="auto"/>
+        <w:ind w:left="360" w:hanging="216"/>
+      </w:pPr>
+      <w:r>
+        <w:rPr>
+          <w:rFonts w:ascii="Calibri" w:hAnsi="Calibri" w:cs="Calibri"/>
+          <w:sz w:val="21"/>
+          <w:szCs w:val="21"/>
+        </w:rPr>
+        <w:t xml:space="preserve">Provided real-time English-Korean interpretation in high-security, multi-agency environments for international stakeholders</w:t>
+      </w:r>
+    </w:p>
+    <w:p>
+      <w:pPr>
+        <w:numPr>
+          <w:ilvl w:val="0"/>
+          <w:numId w:val="1"/>
+        </w:numPr>
+        <w:spacing w:before="0" w:after="0" w:line="220" w:lineRule="auto"/>
+        <w:ind w:left="360" w:hanging="216"/>
+      </w:pPr>
+      <w:r>
+        <w:rPr>
+          <w:rFonts w:ascii="Calibri" w:hAnsi="Calibri" w:cs="Calibri"/>
+          <w:sz w:val="21"/>
+          <w:szCs w:val="21"/>
+        </w:rPr>
+        <w:t xml:space="preserve">Translated sensitive documents and briefings with precision, enabling coordination across government and defense teams</w:t>
       </w:r>
     </w:p>
     <w:p>
@@ -408,266 +544,43 @@
         <w:tabs>
           <w:tab w:val="right" w:pos="10944"/>
         </w:tabs>
-        <w:spacing w:before="60" w:after="0" w:line="212" w:lineRule="auto"/>
-      </w:pPr>
-      <w:r>
-        <w:rPr>
-          <w:rFonts w:ascii="Calibri" w:hAnsi="Calibri" w:cs="Calibri"/>
-          <w:b/>
-          <w:bCs/>
-          <w:sz w:val="21"/>
-          <w:szCs w:val="21"/>
-        </w:rPr>
-        <w:t xml:space="preserve">Project Lead &amp; Product Designer</w:t>
-      </w:r>
-      <w:r>
-        <w:rPr>
-          <w:rFonts w:ascii="Calibri" w:hAnsi="Calibri" w:cs="Calibri"/>
-          <w:sz w:val="21"/>
-          <w:szCs w:val="21"/>
+        <w:spacing w:before="100" w:after="0" w:line="220" w:lineRule="auto"/>
+      </w:pPr>
+      <w:r>
+        <w:rPr>
+          <w:rFonts w:ascii="Calibri" w:hAnsi="Calibri" w:cs="Calibri"/>
+          <w:b/>
+          <w:bCs/>
+          <w:sz w:val="21"/>
+          <w:szCs w:val="21"/>
+        </w:rPr>
+        <w:t xml:space="preserve">Database Engineer Intern</w:t>
+      </w:r>
+      <w:r>
+        <w:rPr>
+          <w:rFonts w:ascii="Calibri" w:hAnsi="Calibri" w:cs="Calibri"/>
+          <w:sz w:val="21"/>
+          <w:szCs w:val="21"/>
+        </w:rPr>
+        <w:t xml:space="preserve">, IT-Farm</w:t>
+      </w:r>
+      <w:r>
+        <w:rPr>
+          <w:rFonts w:ascii="Calibri" w:hAnsi="Calibri" w:cs="Calibri"/>
+          <w:sz w:val="20"/>
+          <w:szCs w:val="20"/>
         </w:rPr>
         <w:tab/>
-        <w:t xml:space="preserve">Jan 2025 – Present</w:t>
-      </w:r>
-    </w:p>
-    <w:p>
-      <w:pPr>
-        <w:tabs>
-          <w:tab w:val="right" w:pos="10944"/>
-        </w:tabs>
-        <w:spacing w:before="0" w:after="0" w:line="212" w:lineRule="auto"/>
-      </w:pPr>
-      <w:r>
-        <w:rPr>
-          <w:rFonts w:ascii="Calibri" w:hAnsi="Calibri" w:cs="Calibri"/>
-          <w:i/>
-          <w:iCs/>
-          <w:sz w:val="20"/>
-          <w:szCs w:val="20"/>
-        </w:rPr>
-        <w:t xml:space="preserve">Penn Spark (Red Team)</w:t>
-      </w:r>
-      <w:r>
-        <w:rPr>
-          <w:rFonts w:ascii="Calibri" w:hAnsi="Calibri" w:cs="Calibri"/>
-          <w:i/>
-          <w:iCs/>
-          <w:sz w:val="20"/>
-          <w:szCs w:val="20"/>
-        </w:rPr>
-        <w:tab/>
-        <w:t xml:space="preserve">Philadelphia, PA</w:t>
-      </w:r>
-    </w:p>
-    <w:p>
-      <w:pPr>
-        <w:numPr>
-          <w:ilvl w:val="0"/>
-          <w:numId w:val="1"/>
-        </w:numPr>
-        <w:spacing w:before="0" w:after="0" w:line="212" w:lineRule="auto"/>
-        <w:ind w:left="360" w:hanging="216"/>
-      </w:pPr>
-      <w:r>
-        <w:rPr>
-          <w:rFonts w:ascii="Calibri" w:hAnsi="Calibri" w:cs="Calibri"/>
-          <w:sz w:val="21"/>
-          <w:szCs w:val="21"/>
-        </w:rPr>
-        <w:t xml:space="preserve">Led a 15+-person cross-functional team of designers and developers to ship client-facing 0-to-1 products</w:t>
-      </w:r>
-    </w:p>
-    <w:p>
-      <w:pPr>
-        <w:numPr>
-          <w:ilvl w:val="0"/>
-          <w:numId w:val="1"/>
-        </w:numPr>
-        <w:spacing w:before="0" w:after="0" w:line="212" w:lineRule="auto"/>
-        <w:ind w:left="360" w:hanging="216"/>
-      </w:pPr>
-      <w:r>
-        <w:rPr>
-          <w:rFonts w:ascii="Calibri" w:hAnsi="Calibri" w:cs="Calibri"/>
-          <w:sz w:val="21"/>
-          <w:szCs w:val="21"/>
-        </w:rPr>
-        <w:t xml:space="preserve">Defined end-to-end user flows, interaction patterns, and reusable interface systems across multiple deliverables</w:t>
-      </w:r>
-    </w:p>
-    <w:p>
-      <w:pPr>
-        <w:numPr>
-          <w:ilvl w:val="0"/>
-          <w:numId w:val="1"/>
-        </w:numPr>
-        <w:spacing w:before="0" w:after="0" w:line="212" w:lineRule="auto"/>
-        <w:ind w:left="360" w:hanging="216"/>
-      </w:pPr>
-      <w:r>
-        <w:rPr>
-          <w:rFonts w:ascii="Calibri" w:hAnsi="Calibri" w:cs="Calibri"/>
-          <w:sz w:val="21"/>
-          <w:szCs w:val="21"/>
-        </w:rPr>
-        <w:t xml:space="preserve">Shipped polished, user-centered features across semester-long client project cycles</w:t>
-      </w:r>
-    </w:p>
-    <w:p>
-      <w:pPr>
-        <w:tabs>
-          <w:tab w:val="right" w:pos="10944"/>
-        </w:tabs>
-        <w:spacing w:before="60" w:after="0" w:line="212" w:lineRule="auto"/>
-      </w:pPr>
-      <w:r>
-        <w:rPr>
-          <w:rFonts w:ascii="Calibri" w:hAnsi="Calibri" w:cs="Calibri"/>
-          <w:b/>
-          <w:bCs/>
-          <w:sz w:val="21"/>
-          <w:szCs w:val="21"/>
-        </w:rPr>
-        <w:t xml:space="preserve">Military Interpreter</w:t>
-      </w:r>
-      <w:r>
-        <w:rPr>
-          <w:rFonts w:ascii="Calibri" w:hAnsi="Calibri" w:cs="Calibri"/>
-          <w:sz w:val="21"/>
-          <w:szCs w:val="21"/>
-        </w:rPr>
-        <w:tab/>
-        <w:t xml:space="preserve">Dec 2022 – June 2024</w:t>
-      </w:r>
-    </w:p>
-    <w:p>
-      <w:pPr>
-        <w:tabs>
-          <w:tab w:val="right" w:pos="10944"/>
-        </w:tabs>
-        <w:spacing w:before="0" w:after="0" w:line="212" w:lineRule="auto"/>
-      </w:pPr>
-      <w:r>
-        <w:rPr>
-          <w:rFonts w:ascii="Calibri" w:hAnsi="Calibri" w:cs="Calibri"/>
-          <w:i/>
-          <w:iCs/>
-          <w:sz w:val="20"/>
-          <w:szCs w:val="20"/>
-        </w:rPr>
-        <w:t xml:space="preserve">Capital Defense Command (ROK Army)</w:t>
-      </w:r>
-      <w:r>
-        <w:rPr>
-          <w:rFonts w:ascii="Calibri" w:hAnsi="Calibri" w:cs="Calibri"/>
-          <w:i/>
-          <w:iCs/>
-          <w:sz w:val="20"/>
-          <w:szCs w:val="20"/>
-        </w:rPr>
-        <w:tab/>
-        <w:t xml:space="preserve">Seoul, South Korea</w:t>
-      </w:r>
-    </w:p>
-    <w:p>
-      <w:pPr>
-        <w:numPr>
-          <w:ilvl w:val="0"/>
-          <w:numId w:val="1"/>
-        </w:numPr>
-        <w:spacing w:before="0" w:after="0" w:line="212" w:lineRule="auto"/>
-        <w:ind w:left="360" w:hanging="216"/>
-      </w:pPr>
-      <w:r>
-        <w:rPr>
-          <w:rFonts w:ascii="Calibri" w:hAnsi="Calibri" w:cs="Calibri"/>
-          <w:sz w:val="21"/>
-          <w:szCs w:val="21"/>
-        </w:rPr>
-        <w:t xml:space="preserve">Provided real-time English-Korean interpretation in high-security, multi-agency environments for international stakeholders</w:t>
-      </w:r>
-    </w:p>
-    <w:p>
-      <w:pPr>
-        <w:numPr>
-          <w:ilvl w:val="0"/>
-          <w:numId w:val="1"/>
-        </w:numPr>
-        <w:spacing w:before="0" w:after="0" w:line="212" w:lineRule="auto"/>
-        <w:ind w:left="360" w:hanging="216"/>
-      </w:pPr>
-      <w:r>
-        <w:rPr>
-          <w:rFonts w:ascii="Calibri" w:hAnsi="Calibri" w:cs="Calibri"/>
-          <w:sz w:val="21"/>
-          <w:szCs w:val="21"/>
-        </w:rPr>
-        <w:t xml:space="preserve">Translated sensitive documents and briefings with precision, enabling coordination across government and defense teams</w:t>
-      </w:r>
-    </w:p>
-    <w:p>
-      <w:pPr>
-        <w:tabs>
-          <w:tab w:val="right" w:pos="10944"/>
-        </w:tabs>
-        <w:spacing w:before="60" w:after="0" w:line="212" w:lineRule="auto"/>
-      </w:pPr>
-      <w:r>
-        <w:rPr>
-          <w:rFonts w:ascii="Calibri" w:hAnsi="Calibri" w:cs="Calibri"/>
-          <w:b/>
-          <w:bCs/>
-          <w:sz w:val="21"/>
-          <w:szCs w:val="21"/>
-        </w:rPr>
-        <w:t xml:space="preserve">Database Engineer Intern</w:t>
-      </w:r>
-      <w:r>
-        <w:rPr>
-          <w:rFonts w:ascii="Calibri" w:hAnsi="Calibri" w:cs="Calibri"/>
-          <w:sz w:val="21"/>
-          <w:szCs w:val="21"/>
-        </w:rPr>
-        <w:tab/>
-        <w:t xml:space="preserve">June 2022 – Aug 2022</w:t>
-      </w:r>
-    </w:p>
-    <w:p>
-      <w:pPr>
-        <w:tabs>
-          <w:tab w:val="right" w:pos="10944"/>
-        </w:tabs>
-        <w:spacing w:before="0" w:after="0" w:line="212" w:lineRule="auto"/>
-      </w:pPr>
-      <w:r>
-        <w:rPr>
-          <w:rFonts w:ascii="Calibri" w:hAnsi="Calibri" w:cs="Calibri"/>
-          <w:i/>
-          <w:iCs/>
-          <w:sz w:val="20"/>
-          <w:szCs w:val="20"/>
-        </w:rPr>
-        <w:t xml:space="preserve">IT-Farm</w:t>
-      </w:r>
-      <w:r>
-        <w:rPr>
-          <w:rFonts w:ascii="Calibri" w:hAnsi="Calibri" w:cs="Calibri"/>
-          <w:i/>
-          <w:iCs/>
-          <w:sz w:val="20"/>
-          <w:szCs w:val="20"/>
-        </w:rPr>
-        <w:tab/>
-        <w:t xml:space="preserve">Seongnam, South Korea</w:t>
-      </w:r>
-    </w:p>
-    <w:p>
-      <w:pPr>
-        <w:numPr>
-          <w:ilvl w:val="0"/>
-          <w:numId w:val="1"/>
-        </w:numPr>
-        <w:spacing w:before="0" w:after="0" w:line="212" w:lineRule="auto"/>
+        <w:t xml:space="preserve">June 2022 – Aug 2022  ·  Seongnam, South Korea</w:t>
+      </w:r>
+    </w:p>
+    <w:p>
+      <w:pPr>
+        <w:numPr>
+          <w:ilvl w:val="0"/>
+          <w:numId w:val="1"/>
+        </w:numPr>
+        <w:spacing w:before="0" w:after="0" w:line="220" w:lineRule="auto"/>
         <w:ind w:left="360" w:hanging="216"/>
       </w:pPr>
       <w:r>
@@ -685,7 +598,7 @@
           <w:ilvl w:val="0"/>
           <w:numId w:val="1"/>
         </w:numPr>
-        <w:spacing w:before="0" w:after="0" w:line="212" w:lineRule="auto"/>
+        <w:spacing w:before="0" w:after="0" w:line="220" w:lineRule="auto"/>
         <w:ind w:left="360" w:hanging="216"/>
       </w:pPr>
       <w:r>
@@ -703,7 +616,7 @@
           <w:ilvl w:val="0"/>
           <w:numId w:val="1"/>
         </w:numPr>
-        <w:spacing w:before="0" w:after="0" w:line="212" w:lineRule="auto"/>
+        <w:spacing w:before="0" w:after="0" w:line="220" w:lineRule="auto"/>
         <w:ind w:left="360" w:hanging="216"/>
       </w:pPr>
       <w:r>
@@ -720,7 +633,7 @@
         <w:pBdr>
           <w:bottom w:val="single" w:sz="6" w:space="1" w:color="000000"/>
         </w:pBdr>
-        <w:spacing w:before="60" w:after="40" w:line="212" w:lineRule="auto"/>
+        <w:spacing w:before="60" w:after="40" w:line="220" w:lineRule="auto"/>
       </w:pPr>
       <w:r>
         <w:rPr>
@@ -740,7 +653,7 @@
         <w:tabs>
           <w:tab w:val="right" w:pos="10944"/>
         </w:tabs>
-        <w:spacing w:before="60" w:after="0" w:line="212" w:lineRule="auto"/>
+        <w:spacing w:before="60" w:after="0" w:line="220" w:lineRule="auto"/>
       </w:pPr>
       <w:hyperlink r:id="rH3">
         <w:r>
@@ -790,7 +703,7 @@
           <w:ilvl w:val="0"/>
           <w:numId w:val="1"/>
         </w:numPr>
-        <w:spacing w:before="0" w:after="0" w:line="212" w:lineRule="auto"/>
+        <w:spacing w:before="0" w:after="0" w:line="220" w:lineRule="auto"/>
         <w:ind w:left="360" w:hanging="216"/>
       </w:pPr>
       <w:r>
@@ -808,7 +721,7 @@
           <w:ilvl w:val="0"/>
           <w:numId w:val="1"/>
         </w:numPr>
-        <w:spacing w:before="0" w:after="0" w:line="212" w:lineRule="auto"/>
+        <w:spacing w:before="0" w:after="0" w:line="220" w:lineRule="auto"/>
         <w:ind w:left="360" w:hanging="216"/>
       </w:pPr>
       <w:r>
@@ -826,7 +739,7 @@
           <w:ilvl w:val="0"/>
           <w:numId w:val="1"/>
         </w:numPr>
-        <w:spacing w:before="0" w:after="0" w:line="212" w:lineRule="auto"/>
+        <w:spacing w:before="0" w:after="0" w:line="220" w:lineRule="auto"/>
         <w:ind w:left="360" w:hanging="216"/>
       </w:pPr>
       <w:r>
@@ -843,7 +756,7 @@
         <w:tabs>
           <w:tab w:val="right" w:pos="10944"/>
         </w:tabs>
-        <w:spacing w:before="60" w:after="0" w:line="212" w:lineRule="auto"/>
+        <w:spacing w:before="60" w:after="0" w:line="220" w:lineRule="auto"/>
       </w:pPr>
       <w:hyperlink r:id="rH4">
         <w:r>
@@ -893,7 +806,7 @@
           <w:ilvl w:val="0"/>
           <w:numId w:val="1"/>
         </w:numPr>
-        <w:spacing w:before="0" w:after="0" w:line="212" w:lineRule="auto"/>
+        <w:spacing w:before="0" w:after="0" w:line="220" w:lineRule="auto"/>
         <w:ind w:left="360" w:hanging="216"/>
       </w:pPr>
       <w:r>
@@ -911,7 +824,7 @@
           <w:ilvl w:val="0"/>
           <w:numId w:val="1"/>
         </w:numPr>
-        <w:spacing w:before="0" w:after="0" w:line="212" w:lineRule="auto"/>
+        <w:spacing w:before="0" w:after="0" w:line="220" w:lineRule="auto"/>
         <w:ind w:left="360" w:hanging="216"/>
       </w:pPr>
       <w:r>
@@ -929,7 +842,7 @@
           <w:ilvl w:val="0"/>
           <w:numId w:val="1"/>
         </w:numPr>
-        <w:spacing w:before="0" w:after="0" w:line="212" w:lineRule="auto"/>
+        <w:spacing w:before="0" w:after="0" w:line="220" w:lineRule="auto"/>
         <w:ind w:left="360" w:hanging="216"/>
       </w:pPr>
       <w:r>
@@ -946,7 +859,7 @@
         <w:tabs>
           <w:tab w:val="right" w:pos="10944"/>
         </w:tabs>
-        <w:spacing w:before="60" w:after="0" w:line="212" w:lineRule="auto"/>
+        <w:spacing w:before="60" w:after="0" w:line="220" w:lineRule="auto"/>
       </w:pPr>
       <w:hyperlink r:id="rH5">
         <w:r>
@@ -996,7 +909,7 @@
           <w:ilvl w:val="0"/>
           <w:numId w:val="1"/>
         </w:numPr>
-        <w:spacing w:before="0" w:after="0" w:line="212" w:lineRule="auto"/>
+        <w:spacing w:before="0" w:after="0" w:line="220" w:lineRule="auto"/>
         <w:ind w:left="360" w:hanging="216"/>
       </w:pPr>
       <w:r>
@@ -1014,7 +927,7 @@
           <w:ilvl w:val="0"/>
           <w:numId w:val="1"/>
         </w:numPr>
-        <w:spacing w:before="0" w:after="0" w:line="212" w:lineRule="auto"/>
+        <w:spacing w:before="0" w:after="0" w:line="220" w:lineRule="auto"/>
         <w:ind w:left="360" w:hanging="216"/>
       </w:pPr>
       <w:r>
@@ -1032,7 +945,7 @@
           <w:ilvl w:val="0"/>
           <w:numId w:val="1"/>
         </w:numPr>
-        <w:spacing w:before="0" w:after="0" w:line="212" w:lineRule="auto"/>
+        <w:spacing w:before="0" w:after="0" w:line="220" w:lineRule="auto"/>
         <w:ind w:left="360" w:hanging="216"/>
       </w:pPr>
       <w:r>
@@ -1049,7 +962,7 @@
         <w:pBdr>
           <w:bottom w:val="single" w:sz="6" w:space="1" w:color="000000"/>
         </w:pBdr>
-        <w:spacing w:before="60" w:after="40" w:line="212" w:lineRule="auto"/>
+        <w:spacing w:before="60" w:after="40" w:line="220" w:lineRule="auto"/>
       </w:pPr>
       <w:r>
         <w:rPr>
@@ -1066,7 +979,7 @@
     </w:p>
     <w:p>
       <w:pPr>
-        <w:spacing w:before="40" w:after="0" w:line="212" w:lineRule="auto"/>
+        <w:spacing w:before="40" w:after="0" w:line="220" w:lineRule="auto"/>
       </w:pPr>
       <w:r>
         <w:rPr>
@@ -1089,7 +1002,7 @@
     </w:p>
     <w:p>
       <w:pPr>
-        <w:spacing w:before="0" w:after="0" w:line="212" w:lineRule="auto"/>
+        <w:spacing w:before="0" w:after="0" w:line="220" w:lineRule="auto"/>
       </w:pPr>
       <w:r>
         <w:rPr>
@@ -1112,7 +1025,7 @@
     </w:p>
     <w:p>
       <w:pPr>
-        <w:spacing w:before="0" w:after="0" w:line="212" w:lineRule="auto"/>
+        <w:spacing w:before="0" w:after="0" w:line="220" w:lineRule="auto"/>
       </w:pPr>
       <w:r>
         <w:rPr>

</xml_diff>

<commit_message>
resume: remove project hyperlinks (project titles now plain text; contact links kept)
</commit_message>
<xml_diff>
--- a/apps/resume/dist/Brian_Lee_Resume_Design.docx
+++ b/apps/resume/dist/Brian_Lee_Resume_Design.docx
@@ -655,20 +655,16 @@
         </w:tabs>
         <w:spacing w:before="60" w:after="0" w:line="220" w:lineRule="auto"/>
       </w:pPr>
-      <w:hyperlink r:id="rH3">
-        <w:r>
-          <w:rPr>
-            <w:rFonts w:ascii="Calibri" w:hAnsi="Calibri" w:cs="Calibri"/>
-            <w:b/>
-            <w:bCs/>
-            <w:color w:val="1155cc"/>
-            <w:u w:val="single"/>
-            <w:sz w:val="21"/>
-            <w:szCs w:val="21"/>
-          </w:rPr>
-          <w:t xml:space="preserve">Path@Penn Redesign</w:t>
-        </w:r>
-      </w:hyperlink>
+      <w:r>
+        <w:rPr>
+          <w:rFonts w:ascii="Calibri" w:hAnsi="Calibri" w:cs="Calibri"/>
+          <w:b/>
+          <w:bCs/>
+          <w:sz w:val="21"/>
+          <w:szCs w:val="21"/>
+        </w:rPr>
+        <w:t xml:space="preserve">Path@Penn Redesign</w:t>
+      </w:r>
       <w:r>
         <w:rPr>
           <w:rFonts w:ascii="Calibri" w:hAnsi="Calibri" w:cs="Calibri"/>
@@ -758,20 +754,16 @@
         </w:tabs>
         <w:spacing w:before="60" w:after="0" w:line="220" w:lineRule="auto"/>
       </w:pPr>
-      <w:hyperlink r:id="rH4">
-        <w:r>
-          <w:rPr>
-            <w:rFonts w:ascii="Calibri" w:hAnsi="Calibri" w:cs="Calibri"/>
-            <w:b/>
-            <w:bCs/>
-            <w:color w:val="1155cc"/>
-            <w:u w:val="single"/>
-            <w:sz w:val="21"/>
-            <w:szCs w:val="21"/>
-          </w:rPr>
-          <w:t xml:space="preserve">Penn Spark Website Redesign</w:t>
-        </w:r>
-      </w:hyperlink>
+      <w:r>
+        <w:rPr>
+          <w:rFonts w:ascii="Calibri" w:hAnsi="Calibri" w:cs="Calibri"/>
+          <w:b/>
+          <w:bCs/>
+          <w:sz w:val="21"/>
+          <w:szCs w:val="21"/>
+        </w:rPr>
+        <w:t xml:space="preserve">Penn Spark Website Redesign</w:t>
+      </w:r>
       <w:r>
         <w:rPr>
           <w:rFonts w:ascii="Calibri" w:hAnsi="Calibri" w:cs="Calibri"/>
@@ -861,20 +853,16 @@
         </w:tabs>
         <w:spacing w:before="60" w:after="0" w:line="220" w:lineRule="auto"/>
       </w:pPr>
-      <w:hyperlink r:id="rH5">
-        <w:r>
-          <w:rPr>
-            <w:rFonts w:ascii="Calibri" w:hAnsi="Calibri" w:cs="Calibri"/>
-            <w:b/>
-            <w:bCs/>
-            <w:color w:val="1155cc"/>
-            <w:u w:val="single"/>
-            <w:sz w:val="21"/>
-            <w:szCs w:val="21"/>
-          </w:rPr>
-          <w:t xml:space="preserve">Wikipedia Mobile Redesign</w:t>
-        </w:r>
-      </w:hyperlink>
+      <w:r>
+        <w:rPr>
+          <w:rFonts w:ascii="Calibri" w:hAnsi="Calibri" w:cs="Calibri"/>
+          <w:b/>
+          <w:bCs/>
+          <w:sz w:val="21"/>
+          <w:szCs w:val="21"/>
+        </w:rPr>
+        <w:t xml:space="preserve">Wikipedia Mobile Redesign</w:t>
+      </w:r>
       <w:r>
         <w:rPr>
           <w:rFonts w:ascii="Calibri" w:hAnsi="Calibri" w:cs="Calibri"/>

</xml_diff>

<commit_message>
resume: LinkedIn link embedded in 'LinkedIn' text + bold key metrics/results/tech throughout for scannability
</commit_message>
<xml_diff>
--- a/apps/resume/dist/Brian_Lee_Resume_Design.docx
+++ b/apps/resume/dist/Brian_Lee_Resume_Design.docx
@@ -60,7 +60,7 @@
             <w:sz w:val="20"/>
             <w:szCs w:val="20"/>
           </w:rPr>
-          <w:t xml:space="preserve">linkedin.com/in/brian-lee-0b706b225</w:t>
+          <w:t xml:space="preserve">LinkedIn</w:t>
         </w:r>
       </w:hyperlink>
     </w:p>
@@ -233,61 +233,143 @@
           <w:sz w:val="21"/>
           <w:szCs w:val="21"/>
         </w:rPr>
-        <w:t xml:space="preserve">Built a deterministic Figma-to-React Native pipeline at a 4-engineer YC startup, turning designs into tokenized Expo components and shipping it as a reusable team skill</w:t>
-      </w:r>
-    </w:p>
-    <w:p>
-      <w:pPr>
-        <w:numPr>
-          <w:ilvl w:val="0"/>
-          <w:numId w:val="1"/>
-        </w:numPr>
-        <w:spacing w:before="0" w:after="0" w:line="220" w:lineRule="auto"/>
-        <w:ind w:left="360" w:hanging="216"/>
-      </w:pPr>
-      <w:r>
-        <w:rPr>
-          <w:rFonts w:ascii="Calibri" w:hAnsi="Calibri" w:cs="Calibri"/>
-          <w:sz w:val="21"/>
-          <w:szCs w:val="21"/>
-        </w:rPr>
-        <w:t xml:space="preserve">Analyzed onboarding-trial data and surfaced a mobile session-entry drop-off (roughly half the desktop activation rate), recommending a pre-session audio gate that reshaped onboarding priorities</w:t>
-      </w:r>
-    </w:p>
-    <w:p>
-      <w:pPr>
-        <w:numPr>
-          <w:ilvl w:val="0"/>
-          <w:numId w:val="1"/>
-        </w:numPr>
-        <w:spacing w:before="0" w:after="0" w:line="220" w:lineRule="auto"/>
-        <w:ind w:left="360" w:hanging="216"/>
-      </w:pPr>
-      <w:r>
-        <w:rPr>
-          <w:rFonts w:ascii="Calibri" w:hAnsi="Calibri" w:cs="Calibri"/>
-          <w:sz w:val="21"/>
-          <w:szCs w:val="21"/>
-        </w:rPr>
-        <w:t xml:space="preserve">Designed declarative mode-authoring tooling (schema + conformance linter) so new AI-character game modes ship as data, not bespoke code</w:t>
-      </w:r>
-    </w:p>
-    <w:p>
-      <w:pPr>
-        <w:numPr>
-          <w:ilvl w:val="0"/>
-          <w:numId w:val="1"/>
-        </w:numPr>
-        <w:spacing w:before="0" w:after="0" w:line="220" w:lineRule="auto"/>
-        <w:ind w:left="360" w:hanging="216"/>
-      </w:pPr>
-      <w:r>
-        <w:rPr>
-          <w:rFonts w:ascii="Calibri" w:hAnsi="Calibri" w:cs="Calibri"/>
-          <w:sz w:val="21"/>
-          <w:szCs w:val="21"/>
-        </w:rPr>
-        <w:t xml:space="preserve">Prototyped child-friendly notification and error-state UX (warm copy, recovery paths, observability) for a kids' English-learning app</w:t>
+        <w:t xml:space="preserve">Built a deterministic </w:t>
+      </w:r>
+      <w:r>
+        <w:rPr>
+          <w:rFonts w:ascii="Calibri" w:hAnsi="Calibri" w:cs="Calibri"/>
+          <w:b/>
+          <w:bCs/>
+          <w:sz w:val="21"/>
+          <w:szCs w:val="21"/>
+        </w:rPr>
+        <w:t xml:space="preserve">Figma-to-React Native pipeline</w:t>
+      </w:r>
+      <w:r>
+        <w:rPr>
+          <w:rFonts w:ascii="Calibri" w:hAnsi="Calibri" w:cs="Calibri"/>
+          <w:sz w:val="21"/>
+          <w:szCs w:val="21"/>
+        </w:rPr>
+        <w:t xml:space="preserve"> at a 4-engineer YC startup, turning designs into tokenized Expo components and shipping it as a reusable team skill</w:t>
+      </w:r>
+    </w:p>
+    <w:p>
+      <w:pPr>
+        <w:numPr>
+          <w:ilvl w:val="0"/>
+          <w:numId w:val="1"/>
+        </w:numPr>
+        <w:spacing w:before="0" w:after="0" w:line="220" w:lineRule="auto"/>
+        <w:ind w:left="360" w:hanging="216"/>
+      </w:pPr>
+      <w:r>
+        <w:rPr>
+          <w:rFonts w:ascii="Calibri" w:hAnsi="Calibri" w:cs="Calibri"/>
+          <w:sz w:val="21"/>
+          <w:szCs w:val="21"/>
+        </w:rPr>
+        <w:t xml:space="preserve">Analyzed onboarding-trial data and surfaced a </w:t>
+      </w:r>
+      <w:r>
+        <w:rPr>
+          <w:rFonts w:ascii="Calibri" w:hAnsi="Calibri" w:cs="Calibri"/>
+          <w:b/>
+          <w:bCs/>
+          <w:sz w:val="21"/>
+          <w:szCs w:val="21"/>
+        </w:rPr>
+        <w:t xml:space="preserve">mobile session-entry drop-off</w:t>
+      </w:r>
+      <w:r>
+        <w:rPr>
+          <w:rFonts w:ascii="Calibri" w:hAnsi="Calibri" w:cs="Calibri"/>
+          <w:sz w:val="21"/>
+          <w:szCs w:val="21"/>
+        </w:rPr>
+        <w:t xml:space="preserve"> (roughly half the desktop activation rate), recommending a pre-session audio gate that </w:t>
+      </w:r>
+      <w:r>
+        <w:rPr>
+          <w:rFonts w:ascii="Calibri" w:hAnsi="Calibri" w:cs="Calibri"/>
+          <w:b/>
+          <w:bCs/>
+          <w:sz w:val="21"/>
+          <w:szCs w:val="21"/>
+        </w:rPr>
+        <w:t xml:space="preserve">reshaped onboarding priorities</w:t>
+      </w:r>
+    </w:p>
+    <w:p>
+      <w:pPr>
+        <w:numPr>
+          <w:ilvl w:val="0"/>
+          <w:numId w:val="1"/>
+        </w:numPr>
+        <w:spacing w:before="0" w:after="0" w:line="220" w:lineRule="auto"/>
+        <w:ind w:left="360" w:hanging="216"/>
+      </w:pPr>
+      <w:r>
+        <w:rPr>
+          <w:rFonts w:ascii="Calibri" w:hAnsi="Calibri" w:cs="Calibri"/>
+          <w:sz w:val="21"/>
+          <w:szCs w:val="21"/>
+        </w:rPr>
+        <w:t xml:space="preserve">Designed </w:t>
+      </w:r>
+      <w:r>
+        <w:rPr>
+          <w:rFonts w:ascii="Calibri" w:hAnsi="Calibri" w:cs="Calibri"/>
+          <w:b/>
+          <w:bCs/>
+          <w:sz w:val="21"/>
+          <w:szCs w:val="21"/>
+        </w:rPr>
+        <w:t xml:space="preserve">declarative mode-authoring tooling</w:t>
+      </w:r>
+      <w:r>
+        <w:rPr>
+          <w:rFonts w:ascii="Calibri" w:hAnsi="Calibri" w:cs="Calibri"/>
+          <w:sz w:val="21"/>
+          <w:szCs w:val="21"/>
+        </w:rPr>
+        <w:t xml:space="preserve"> (schema + conformance linter) so new AI-character game modes ship as data, not bespoke code</w:t>
+      </w:r>
+    </w:p>
+    <w:p>
+      <w:pPr>
+        <w:numPr>
+          <w:ilvl w:val="0"/>
+          <w:numId w:val="1"/>
+        </w:numPr>
+        <w:spacing w:before="0" w:after="0" w:line="220" w:lineRule="auto"/>
+        <w:ind w:left="360" w:hanging="216"/>
+      </w:pPr>
+      <w:r>
+        <w:rPr>
+          <w:rFonts w:ascii="Calibri" w:hAnsi="Calibri" w:cs="Calibri"/>
+          <w:sz w:val="21"/>
+          <w:szCs w:val="21"/>
+        </w:rPr>
+        <w:t xml:space="preserve">Prototyped </w:t>
+      </w:r>
+      <w:r>
+        <w:rPr>
+          <w:rFonts w:ascii="Calibri" w:hAnsi="Calibri" w:cs="Calibri"/>
+          <w:b/>
+          <w:bCs/>
+          <w:sz w:val="21"/>
+          <w:szCs w:val="21"/>
+        </w:rPr>
+        <w:t xml:space="preserve">child-friendly notification and error-state UX</w:t>
+      </w:r>
+      <w:r>
+        <w:rPr>
+          <w:rFonts w:ascii="Calibri" w:hAnsi="Calibri" w:cs="Calibri"/>
+          <w:sz w:val="21"/>
+          <w:szCs w:val="21"/>
+        </w:rPr>
+        <w:t xml:space="preserve"> (warm copy, recovery paths, observability) for a kids' English-learning app</w:t>
       </w:r>
     </w:p>
     <w:p>
@@ -340,43 +422,97 @@
           <w:sz w:val="21"/>
           <w:szCs w:val="21"/>
         </w:rPr>
-        <w:t xml:space="preserve">Maintained a live portfolio of 50+ Unity mobile game titles, improving UI/UX and core gameplay stability across deployments</w:t>
-      </w:r>
-    </w:p>
-    <w:p>
-      <w:pPr>
-        <w:numPr>
-          <w:ilvl w:val="0"/>
-          <w:numId w:val="1"/>
-        </w:numPr>
-        <w:spacing w:before="0" w:after="0" w:line="220" w:lineRule="auto"/>
-        <w:ind w:left="360" w:hanging="216"/>
-      </w:pPr>
-      <w:r>
-        <w:rPr>
-          <w:rFonts w:ascii="Calibri" w:hAnsi="Calibri" w:cs="Calibri"/>
-          <w:sz w:val="21"/>
-          <w:szCs w:val="21"/>
-        </w:rPr>
-        <w:t xml:space="preserve">Resolved 100+ QA-reported bugs by modifying Unity prefabs and C# scripts, shipping fixes in production releases</w:t>
-      </w:r>
-    </w:p>
-    <w:p>
-      <w:pPr>
-        <w:numPr>
-          <w:ilvl w:val="0"/>
-          <w:numId w:val="1"/>
-        </w:numPr>
-        <w:spacing w:before="0" w:after="0" w:line="220" w:lineRule="auto"/>
-        <w:ind w:left="360" w:hanging="216"/>
-      </w:pPr>
-      <w:r>
-        <w:rPr>
-          <w:rFonts w:ascii="Calibri" w:hAnsi="Calibri" w:cs="Calibri"/>
-          <w:sz w:val="21"/>
-          <w:szCs w:val="21"/>
-        </w:rPr>
-        <w:t xml:space="preserve">Upgraded SDKs and platform modules fleet-wide to meet evolving app-store requirements and sustain production availability</w:t>
+        <w:t xml:space="preserve">Maintained a live portfolio of </w:t>
+      </w:r>
+      <w:r>
+        <w:rPr>
+          <w:rFonts w:ascii="Calibri" w:hAnsi="Calibri" w:cs="Calibri"/>
+          <w:b/>
+          <w:bCs/>
+          <w:sz w:val="21"/>
+          <w:szCs w:val="21"/>
+        </w:rPr>
+        <w:t xml:space="preserve">50+ Unity mobile game titles</w:t>
+      </w:r>
+      <w:r>
+        <w:rPr>
+          <w:rFonts w:ascii="Calibri" w:hAnsi="Calibri" w:cs="Calibri"/>
+          <w:sz w:val="21"/>
+          <w:szCs w:val="21"/>
+        </w:rPr>
+        <w:t xml:space="preserve">, improving UI/UX and core gameplay stability across deployments</w:t>
+      </w:r>
+    </w:p>
+    <w:p>
+      <w:pPr>
+        <w:numPr>
+          <w:ilvl w:val="0"/>
+          <w:numId w:val="1"/>
+        </w:numPr>
+        <w:spacing w:before="0" w:after="0" w:line="220" w:lineRule="auto"/>
+        <w:ind w:left="360" w:hanging="216"/>
+      </w:pPr>
+      <w:r>
+        <w:rPr>
+          <w:rFonts w:ascii="Calibri" w:hAnsi="Calibri" w:cs="Calibri"/>
+          <w:sz w:val="21"/>
+          <w:szCs w:val="21"/>
+        </w:rPr>
+        <w:t xml:space="preserve">Resolved </w:t>
+      </w:r>
+      <w:r>
+        <w:rPr>
+          <w:rFonts w:ascii="Calibri" w:hAnsi="Calibri" w:cs="Calibri"/>
+          <w:b/>
+          <w:bCs/>
+          <w:sz w:val="21"/>
+          <w:szCs w:val="21"/>
+        </w:rPr>
+        <w:t xml:space="preserve">100+ QA-reported bugs</w:t>
+      </w:r>
+      <w:r>
+        <w:rPr>
+          <w:rFonts w:ascii="Calibri" w:hAnsi="Calibri" w:cs="Calibri"/>
+          <w:sz w:val="21"/>
+          <w:szCs w:val="21"/>
+        </w:rPr>
+        <w:t xml:space="preserve"> by modifying Unity prefabs and C# scripts, shipping fixes in production releases</w:t>
+      </w:r>
+    </w:p>
+    <w:p>
+      <w:pPr>
+        <w:numPr>
+          <w:ilvl w:val="0"/>
+          <w:numId w:val="1"/>
+        </w:numPr>
+        <w:spacing w:before="0" w:after="0" w:line="220" w:lineRule="auto"/>
+        <w:ind w:left="360" w:hanging="216"/>
+      </w:pPr>
+      <w:r>
+        <w:rPr>
+          <w:rFonts w:ascii="Calibri" w:hAnsi="Calibri" w:cs="Calibri"/>
+          <w:sz w:val="21"/>
+          <w:szCs w:val="21"/>
+        </w:rPr>
+        <w:t xml:space="preserve">Upgraded SDKs and platform modules </w:t>
+      </w:r>
+      <w:r>
+        <w:rPr>
+          <w:rFonts w:ascii="Calibri" w:hAnsi="Calibri" w:cs="Calibri"/>
+          <w:b/>
+          <w:bCs/>
+          <w:sz w:val="21"/>
+          <w:szCs w:val="21"/>
+        </w:rPr>
+        <w:t xml:space="preserve">fleet-wide</w:t>
+      </w:r>
+      <w:r>
+        <w:rPr>
+          <w:rFonts w:ascii="Calibri" w:hAnsi="Calibri" w:cs="Calibri"/>
+          <w:sz w:val="21"/>
+          <w:szCs w:val="21"/>
+        </w:rPr>
+        <w:t xml:space="preserve"> to meet evolving app-store requirements and sustain production availability</w:t>
       </w:r>
     </w:p>
     <w:p>
@@ -429,43 +565,107 @@
           <w:sz w:val="21"/>
           <w:szCs w:val="21"/>
         </w:rPr>
-        <w:t xml:space="preserve">Led a 15+-person cross-functional team of designers and developers to ship client-facing 0-to-1 products</w:t>
-      </w:r>
-    </w:p>
-    <w:p>
-      <w:pPr>
-        <w:numPr>
-          <w:ilvl w:val="0"/>
-          <w:numId w:val="1"/>
-        </w:numPr>
-        <w:spacing w:before="0" w:after="0" w:line="220" w:lineRule="auto"/>
-        <w:ind w:left="360" w:hanging="216"/>
-      </w:pPr>
-      <w:r>
-        <w:rPr>
-          <w:rFonts w:ascii="Calibri" w:hAnsi="Calibri" w:cs="Calibri"/>
-          <w:sz w:val="21"/>
-          <w:szCs w:val="21"/>
-        </w:rPr>
-        <w:t xml:space="preserve">Defined end-to-end user flows, interaction patterns, and reusable interface systems across multiple deliverables</w:t>
-      </w:r>
-    </w:p>
-    <w:p>
-      <w:pPr>
-        <w:numPr>
-          <w:ilvl w:val="0"/>
-          <w:numId w:val="1"/>
-        </w:numPr>
-        <w:spacing w:before="0" w:after="0" w:line="220" w:lineRule="auto"/>
-        <w:ind w:left="360" w:hanging="216"/>
-      </w:pPr>
-      <w:r>
-        <w:rPr>
-          <w:rFonts w:ascii="Calibri" w:hAnsi="Calibri" w:cs="Calibri"/>
-          <w:sz w:val="21"/>
-          <w:szCs w:val="21"/>
-        </w:rPr>
-        <w:t xml:space="preserve">Shipped polished, user-centered features across semester-long client project cycles</w:t>
+        <w:t xml:space="preserve">Led a </w:t>
+      </w:r>
+      <w:r>
+        <w:rPr>
+          <w:rFonts w:ascii="Calibri" w:hAnsi="Calibri" w:cs="Calibri"/>
+          <w:b/>
+          <w:bCs/>
+          <w:sz w:val="21"/>
+          <w:szCs w:val="21"/>
+        </w:rPr>
+        <w:t xml:space="preserve">15+-person cross-functional team</w:t>
+      </w:r>
+      <w:r>
+        <w:rPr>
+          <w:rFonts w:ascii="Calibri" w:hAnsi="Calibri" w:cs="Calibri"/>
+          <w:sz w:val="21"/>
+          <w:szCs w:val="21"/>
+        </w:rPr>
+        <w:t xml:space="preserve"> of designers and developers to ship client-facing </w:t>
+      </w:r>
+      <w:r>
+        <w:rPr>
+          <w:rFonts w:ascii="Calibri" w:hAnsi="Calibri" w:cs="Calibri"/>
+          <w:b/>
+          <w:bCs/>
+          <w:sz w:val="21"/>
+          <w:szCs w:val="21"/>
+        </w:rPr>
+        <w:t xml:space="preserve">0-to-1 products</w:t>
+      </w:r>
+    </w:p>
+    <w:p>
+      <w:pPr>
+        <w:numPr>
+          <w:ilvl w:val="0"/>
+          <w:numId w:val="1"/>
+        </w:numPr>
+        <w:spacing w:before="0" w:after="0" w:line="220" w:lineRule="auto"/>
+        <w:ind w:left="360" w:hanging="216"/>
+      </w:pPr>
+      <w:r>
+        <w:rPr>
+          <w:rFonts w:ascii="Calibri" w:hAnsi="Calibri" w:cs="Calibri"/>
+          <w:sz w:val="21"/>
+          <w:szCs w:val="21"/>
+        </w:rPr>
+        <w:t xml:space="preserve">Defined </w:t>
+      </w:r>
+      <w:r>
+        <w:rPr>
+          <w:rFonts w:ascii="Calibri" w:hAnsi="Calibri" w:cs="Calibri"/>
+          <w:b/>
+          <w:bCs/>
+          <w:sz w:val="21"/>
+          <w:szCs w:val="21"/>
+        </w:rPr>
+        <w:t xml:space="preserve">end-to-end user flows</w:t>
+      </w:r>
+      <w:r>
+        <w:rPr>
+          <w:rFonts w:ascii="Calibri" w:hAnsi="Calibri" w:cs="Calibri"/>
+          <w:sz w:val="21"/>
+          <w:szCs w:val="21"/>
+        </w:rPr>
+        <w:t xml:space="preserve">, interaction patterns, and reusable interface systems across multiple deliverables</w:t>
+      </w:r>
+    </w:p>
+    <w:p>
+      <w:pPr>
+        <w:numPr>
+          <w:ilvl w:val="0"/>
+          <w:numId w:val="1"/>
+        </w:numPr>
+        <w:spacing w:before="0" w:after="0" w:line="220" w:lineRule="auto"/>
+        <w:ind w:left="360" w:hanging="216"/>
+      </w:pPr>
+      <w:r>
+        <w:rPr>
+          <w:rFonts w:ascii="Calibri" w:hAnsi="Calibri" w:cs="Calibri"/>
+          <w:sz w:val="21"/>
+          <w:szCs w:val="21"/>
+        </w:rPr>
+        <w:t xml:space="preserve">Shipped polished, </w:t>
+      </w:r>
+      <w:r>
+        <w:rPr>
+          <w:rFonts w:ascii="Calibri" w:hAnsi="Calibri" w:cs="Calibri"/>
+          <w:b/>
+          <w:bCs/>
+          <w:sz w:val="21"/>
+          <w:szCs w:val="21"/>
+        </w:rPr>
+        <w:t xml:space="preserve">user-centered features</w:t>
+      </w:r>
+      <w:r>
+        <w:rPr>
+          <w:rFonts w:ascii="Calibri" w:hAnsi="Calibri" w:cs="Calibri"/>
+          <w:sz w:val="21"/>
+          <w:szCs w:val="21"/>
+        </w:rPr>
+        <w:t xml:space="preserve"> across semester-long client project cycles</w:t>
       </w:r>
     </w:p>
     <w:p>
@@ -518,25 +718,61 @@
           <w:sz w:val="21"/>
           <w:szCs w:val="21"/>
         </w:rPr>
-        <w:t xml:space="preserve">Provided real-time English-Korean interpretation in high-security, multi-agency environments for international stakeholders</w:t>
-      </w:r>
-    </w:p>
-    <w:p>
-      <w:pPr>
-        <w:numPr>
-          <w:ilvl w:val="0"/>
-          <w:numId w:val="1"/>
-        </w:numPr>
-        <w:spacing w:before="0" w:after="0" w:line="220" w:lineRule="auto"/>
-        <w:ind w:left="360" w:hanging="216"/>
-      </w:pPr>
-      <w:r>
-        <w:rPr>
-          <w:rFonts w:ascii="Calibri" w:hAnsi="Calibri" w:cs="Calibri"/>
-          <w:sz w:val="21"/>
-          <w:szCs w:val="21"/>
-        </w:rPr>
-        <w:t xml:space="preserve">Translated sensitive documents and briefings with precision, enabling coordination across government and defense teams</w:t>
+        <w:t xml:space="preserve">Provided </w:t>
+      </w:r>
+      <w:r>
+        <w:rPr>
+          <w:rFonts w:ascii="Calibri" w:hAnsi="Calibri" w:cs="Calibri"/>
+          <w:b/>
+          <w:bCs/>
+          <w:sz w:val="21"/>
+          <w:szCs w:val="21"/>
+        </w:rPr>
+        <w:t xml:space="preserve">real-time English-Korean interpretation</w:t>
+      </w:r>
+      <w:r>
+        <w:rPr>
+          <w:rFonts w:ascii="Calibri" w:hAnsi="Calibri" w:cs="Calibri"/>
+          <w:sz w:val="21"/>
+          <w:szCs w:val="21"/>
+        </w:rPr>
+        <w:t xml:space="preserve"> in high-security, multi-agency environments for international stakeholders</w:t>
+      </w:r>
+    </w:p>
+    <w:p>
+      <w:pPr>
+        <w:numPr>
+          <w:ilvl w:val="0"/>
+          <w:numId w:val="1"/>
+        </w:numPr>
+        <w:spacing w:before="0" w:after="0" w:line="220" w:lineRule="auto"/>
+        <w:ind w:left="360" w:hanging="216"/>
+      </w:pPr>
+      <w:r>
+        <w:rPr>
+          <w:rFonts w:ascii="Calibri" w:hAnsi="Calibri" w:cs="Calibri"/>
+          <w:sz w:val="21"/>
+          <w:szCs w:val="21"/>
+        </w:rPr>
+        <w:t xml:space="preserve">Translated </w:t>
+      </w:r>
+      <w:r>
+        <w:rPr>
+          <w:rFonts w:ascii="Calibri" w:hAnsi="Calibri" w:cs="Calibri"/>
+          <w:b/>
+          <w:bCs/>
+          <w:sz w:val="21"/>
+          <w:szCs w:val="21"/>
+        </w:rPr>
+        <w:t xml:space="preserve">sensitive documents and briefings</w:t>
+      </w:r>
+      <w:r>
+        <w:rPr>
+          <w:rFonts w:ascii="Calibri" w:hAnsi="Calibri" w:cs="Calibri"/>
+          <w:sz w:val="21"/>
+          <w:szCs w:val="21"/>
+        </w:rPr>
+        <w:t xml:space="preserve"> with precision, enabling coordination across government and defense teams</w:t>
       </w:r>
     </w:p>
     <w:p>
@@ -589,43 +825,97 @@
           <w:sz w:val="21"/>
           <w:szCs w:val="21"/>
         </w:rPr>
-        <w:t xml:space="preserve">Designed and implemented a SQL database prototype managing 1M+ data entities using Oracle and SQLite</w:t>
-      </w:r>
-    </w:p>
-    <w:p>
-      <w:pPr>
-        <w:numPr>
-          <w:ilvl w:val="0"/>
-          <w:numId w:val="1"/>
-        </w:numPr>
-        <w:spacing w:before="0" w:after="0" w:line="220" w:lineRule="auto"/>
-        <w:ind w:left="360" w:hanging="216"/>
-      </w:pPr>
-      <w:r>
-        <w:rPr>
-          <w:rFonts w:ascii="Calibri" w:hAnsi="Calibri" w:cs="Calibri"/>
-          <w:sz w:val="21"/>
-          <w:szCs w:val="21"/>
-        </w:rPr>
-        <w:t xml:space="preserve">Processed and organized semiconductor datasets from 20+ client companies, including Samsung, SK, and LG</w:t>
-      </w:r>
-    </w:p>
-    <w:p>
-      <w:pPr>
-        <w:numPr>
-          <w:ilvl w:val="0"/>
-          <w:numId w:val="1"/>
-        </w:numPr>
-        <w:spacing w:before="0" w:after="0" w:line="220" w:lineRule="auto"/>
-        <w:ind w:left="360" w:hanging="216"/>
-      </w:pPr>
-      <w:r>
-        <w:rPr>
-          <w:rFonts w:ascii="Calibri" w:hAnsi="Calibri" w:cs="Calibri"/>
-          <w:sz w:val="21"/>
-          <w:szCs w:val="21"/>
-        </w:rPr>
-        <w:t xml:space="preserve">Wrote and optimized SQL queries to improve retrieval and management efficiency across large-scale datasets</w:t>
+        <w:t xml:space="preserve">Designed and implemented a SQL database prototype managing </w:t>
+      </w:r>
+      <w:r>
+        <w:rPr>
+          <w:rFonts w:ascii="Calibri" w:hAnsi="Calibri" w:cs="Calibri"/>
+          <w:b/>
+          <w:bCs/>
+          <w:sz w:val="21"/>
+          <w:szCs w:val="21"/>
+        </w:rPr>
+        <w:t xml:space="preserve">1M+ data entities</w:t>
+      </w:r>
+      <w:r>
+        <w:rPr>
+          <w:rFonts w:ascii="Calibri" w:hAnsi="Calibri" w:cs="Calibri"/>
+          <w:sz w:val="21"/>
+          <w:szCs w:val="21"/>
+        </w:rPr>
+        <w:t xml:space="preserve"> using Oracle and SQLite</w:t>
+      </w:r>
+    </w:p>
+    <w:p>
+      <w:pPr>
+        <w:numPr>
+          <w:ilvl w:val="0"/>
+          <w:numId w:val="1"/>
+        </w:numPr>
+        <w:spacing w:before="0" w:after="0" w:line="220" w:lineRule="auto"/>
+        <w:ind w:left="360" w:hanging="216"/>
+      </w:pPr>
+      <w:r>
+        <w:rPr>
+          <w:rFonts w:ascii="Calibri" w:hAnsi="Calibri" w:cs="Calibri"/>
+          <w:sz w:val="21"/>
+          <w:szCs w:val="21"/>
+        </w:rPr>
+        <w:t xml:space="preserve">Processed and organized semiconductor datasets from </w:t>
+      </w:r>
+      <w:r>
+        <w:rPr>
+          <w:rFonts w:ascii="Calibri" w:hAnsi="Calibri" w:cs="Calibri"/>
+          <w:b/>
+          <w:bCs/>
+          <w:sz w:val="21"/>
+          <w:szCs w:val="21"/>
+        </w:rPr>
+        <w:t xml:space="preserve">20+ client companies</w:t>
+      </w:r>
+      <w:r>
+        <w:rPr>
+          <w:rFonts w:ascii="Calibri" w:hAnsi="Calibri" w:cs="Calibri"/>
+          <w:sz w:val="21"/>
+          <w:szCs w:val="21"/>
+        </w:rPr>
+        <w:t xml:space="preserve">, including Samsung, SK, and LG</w:t>
+      </w:r>
+    </w:p>
+    <w:p>
+      <w:pPr>
+        <w:numPr>
+          <w:ilvl w:val="0"/>
+          <w:numId w:val="1"/>
+        </w:numPr>
+        <w:spacing w:before="0" w:after="0" w:line="220" w:lineRule="auto"/>
+        <w:ind w:left="360" w:hanging="216"/>
+      </w:pPr>
+      <w:r>
+        <w:rPr>
+          <w:rFonts w:ascii="Calibri" w:hAnsi="Calibri" w:cs="Calibri"/>
+          <w:sz w:val="21"/>
+          <w:szCs w:val="21"/>
+        </w:rPr>
+        <w:t xml:space="preserve">Wrote and </w:t>
+      </w:r>
+      <w:r>
+        <w:rPr>
+          <w:rFonts w:ascii="Calibri" w:hAnsi="Calibri" w:cs="Calibri"/>
+          <w:b/>
+          <w:bCs/>
+          <w:sz w:val="21"/>
+          <w:szCs w:val="21"/>
+        </w:rPr>
+        <w:t xml:space="preserve">optimized SQL queries</w:t>
+      </w:r>
+      <w:r>
+        <w:rPr>
+          <w:rFonts w:ascii="Calibri" w:hAnsi="Calibri" w:cs="Calibri"/>
+          <w:sz w:val="21"/>
+          <w:szCs w:val="21"/>
+        </w:rPr>
+        <w:t xml:space="preserve"> to improve retrieval and management efficiency across large-scale datasets</w:t>
       </w:r>
     </w:p>
     <w:p>
@@ -708,43 +998,89 @@
           <w:sz w:val="21"/>
           <w:szCs w:val="21"/>
         </w:rPr>
-        <w:t xml:space="preserve">Redesigned Penn's course-registration portal across 4 connected surfaces (Dashboard, Course, Schedule, Degree) to fix visual overload and fragmented planning workflows</w:t>
-      </w:r>
-    </w:p>
-    <w:p>
-      <w:pPr>
-        <w:numPr>
-          <w:ilvl w:val="0"/>
-          <w:numId w:val="1"/>
-        </w:numPr>
-        <w:spacing w:before="0" w:after="0" w:line="220" w:lineRule="auto"/>
-        <w:ind w:left="360" w:hanging="216"/>
-      </w:pPr>
-      <w:r>
-        <w:rPr>
-          <w:rFonts w:ascii="Calibri" w:hAnsi="Calibri" w:cs="Calibri"/>
-          <w:sz w:val="21"/>
-          <w:szCs w:val="21"/>
-        </w:rPr>
-        <w:t xml:space="preserve">Surfaced pain points through observational walkthroughs, student interviews, and a heuristic audit</w:t>
-      </w:r>
-    </w:p>
-    <w:p>
-      <w:pPr>
-        <w:numPr>
-          <w:ilvl w:val="0"/>
-          <w:numId w:val="1"/>
-        </w:numPr>
-        <w:spacing w:before="0" w:after="0" w:line="220" w:lineRule="auto"/>
-        <w:ind w:left="360" w:hanging="216"/>
-      </w:pPr>
-      <w:r>
-        <w:rPr>
-          <w:rFonts w:ascii="Calibri" w:hAnsi="Calibri" w:cs="Calibri"/>
-          <w:sz w:val="21"/>
-          <w:szCs w:val="21"/>
-        </w:rPr>
-        <w:t xml:space="preserve">Designed and usability-tested a hi-fi Figma prototype, translating findings into a clearer, more guided planning flow</w:t>
+        <w:t xml:space="preserve">Redesigned Penn's course-registration portal across </w:t>
+      </w:r>
+      <w:r>
+        <w:rPr>
+          <w:rFonts w:ascii="Calibri" w:hAnsi="Calibri" w:cs="Calibri"/>
+          <w:b/>
+          <w:bCs/>
+          <w:sz w:val="21"/>
+          <w:szCs w:val="21"/>
+        </w:rPr>
+        <w:t xml:space="preserve">4 connected surfaces</w:t>
+      </w:r>
+      <w:r>
+        <w:rPr>
+          <w:rFonts w:ascii="Calibri" w:hAnsi="Calibri" w:cs="Calibri"/>
+          <w:sz w:val="21"/>
+          <w:szCs w:val="21"/>
+        </w:rPr>
+        <w:t xml:space="preserve"> (Dashboard, Course, Schedule, Degree) to fix visual overload and fragmented planning workflows</w:t>
+      </w:r>
+    </w:p>
+    <w:p>
+      <w:pPr>
+        <w:numPr>
+          <w:ilvl w:val="0"/>
+          <w:numId w:val="1"/>
+        </w:numPr>
+        <w:spacing w:before="0" w:after="0" w:line="220" w:lineRule="auto"/>
+        <w:ind w:left="360" w:hanging="216"/>
+      </w:pPr>
+      <w:r>
+        <w:rPr>
+          <w:rFonts w:ascii="Calibri" w:hAnsi="Calibri" w:cs="Calibri"/>
+          <w:sz w:val="21"/>
+          <w:szCs w:val="21"/>
+        </w:rPr>
+        <w:t xml:space="preserve">Surfaced pain points through observational walkthroughs, </w:t>
+      </w:r>
+      <w:r>
+        <w:rPr>
+          <w:rFonts w:ascii="Calibri" w:hAnsi="Calibri" w:cs="Calibri"/>
+          <w:b/>
+          <w:bCs/>
+          <w:sz w:val="21"/>
+          <w:szCs w:val="21"/>
+        </w:rPr>
+        <w:t xml:space="preserve">student interviews, and a heuristic audit</w:t>
+      </w:r>
+    </w:p>
+    <w:p>
+      <w:pPr>
+        <w:numPr>
+          <w:ilvl w:val="0"/>
+          <w:numId w:val="1"/>
+        </w:numPr>
+        <w:spacing w:before="0" w:after="0" w:line="220" w:lineRule="auto"/>
+        <w:ind w:left="360" w:hanging="216"/>
+      </w:pPr>
+      <w:r>
+        <w:rPr>
+          <w:rFonts w:ascii="Calibri" w:hAnsi="Calibri" w:cs="Calibri"/>
+          <w:sz w:val="21"/>
+          <w:szCs w:val="21"/>
+        </w:rPr>
+        <w:t xml:space="preserve">Designed and </w:t>
+      </w:r>
+      <w:r>
+        <w:rPr>
+          <w:rFonts w:ascii="Calibri" w:hAnsi="Calibri" w:cs="Calibri"/>
+          <w:b/>
+          <w:bCs/>
+          <w:sz w:val="21"/>
+          <w:szCs w:val="21"/>
+        </w:rPr>
+        <w:t xml:space="preserve">usability-tested a hi-fi Figma prototype</w:t>
+      </w:r>
+      <w:r>
+        <w:rPr>
+          <w:rFonts w:ascii="Calibri" w:hAnsi="Calibri" w:cs="Calibri"/>
+          <w:sz w:val="21"/>
+          <w:szCs w:val="21"/>
+        </w:rPr>
+        <w:t xml:space="preserve">, translating findings into a clearer, more guided planning flow</w:t>
       </w:r>
     </w:p>
     <w:p>
@@ -807,43 +1143,97 @@
           <w:sz w:val="21"/>
           <w:szCs w:val="21"/>
         </w:rPr>
-        <w:t xml:space="preserve">Led design direction across 10+ designers and developers for the club's public site</w:t>
-      </w:r>
-    </w:p>
-    <w:p>
-      <w:pPr>
-        <w:numPr>
-          <w:ilvl w:val="0"/>
-          <w:numId w:val="1"/>
-        </w:numPr>
-        <w:spacing w:before="0" w:after="0" w:line="220" w:lineRule="auto"/>
-        <w:ind w:left="360" w:hanging="216"/>
-      </w:pPr>
-      <w:r>
-        <w:rPr>
-          <w:rFonts w:ascii="Calibri" w:hAnsi="Calibri" w:cs="Calibri"/>
-          <w:sz w:val="21"/>
-          <w:szCs w:val="21"/>
-        </w:rPr>
-        <w:t xml:space="preserve">Restructured navigation and page hierarchy to improve clarity and discoverability across the browsing experience</w:t>
-      </w:r>
-    </w:p>
-    <w:p>
-      <w:pPr>
-        <w:numPr>
-          <w:ilvl w:val="0"/>
-          <w:numId w:val="1"/>
-        </w:numPr>
-        <w:spacing w:before="0" w:after="0" w:line="220" w:lineRule="auto"/>
-        <w:ind w:left="360" w:hanging="216"/>
-      </w:pPr>
-      <w:r>
-        <w:rPr>
-          <w:rFonts w:ascii="Calibri" w:hAnsi="Calibri" w:cs="Calibri"/>
-          <w:sz w:val="21"/>
-          <w:szCs w:val="21"/>
-        </w:rPr>
-        <w:t xml:space="preserve">Shipped a scalable, data-driven content system with refined hi-fi interfaces and interactions</w:t>
+        <w:t xml:space="preserve">Led design direction across </w:t>
+      </w:r>
+      <w:r>
+        <w:rPr>
+          <w:rFonts w:ascii="Calibri" w:hAnsi="Calibri" w:cs="Calibri"/>
+          <w:b/>
+          <w:bCs/>
+          <w:sz w:val="21"/>
+          <w:szCs w:val="21"/>
+        </w:rPr>
+        <w:t xml:space="preserve">10+ designers and developers</w:t>
+      </w:r>
+      <w:r>
+        <w:rPr>
+          <w:rFonts w:ascii="Calibri" w:hAnsi="Calibri" w:cs="Calibri"/>
+          <w:sz w:val="21"/>
+          <w:szCs w:val="21"/>
+        </w:rPr>
+        <w:t xml:space="preserve"> for the club's public site</w:t>
+      </w:r>
+    </w:p>
+    <w:p>
+      <w:pPr>
+        <w:numPr>
+          <w:ilvl w:val="0"/>
+          <w:numId w:val="1"/>
+        </w:numPr>
+        <w:spacing w:before="0" w:after="0" w:line="220" w:lineRule="auto"/>
+        <w:ind w:left="360" w:hanging="216"/>
+      </w:pPr>
+      <w:r>
+        <w:rPr>
+          <w:rFonts w:ascii="Calibri" w:hAnsi="Calibri" w:cs="Calibri"/>
+          <w:sz w:val="21"/>
+          <w:szCs w:val="21"/>
+        </w:rPr>
+        <w:t xml:space="preserve">Restructured </w:t>
+      </w:r>
+      <w:r>
+        <w:rPr>
+          <w:rFonts w:ascii="Calibri" w:hAnsi="Calibri" w:cs="Calibri"/>
+          <w:b/>
+          <w:bCs/>
+          <w:sz w:val="21"/>
+          <w:szCs w:val="21"/>
+        </w:rPr>
+        <w:t xml:space="preserve">navigation and page hierarchy</w:t>
+      </w:r>
+      <w:r>
+        <w:rPr>
+          <w:rFonts w:ascii="Calibri" w:hAnsi="Calibri" w:cs="Calibri"/>
+          <w:sz w:val="21"/>
+          <w:szCs w:val="21"/>
+        </w:rPr>
+        <w:t xml:space="preserve"> to improve clarity and discoverability across the browsing experience</w:t>
+      </w:r>
+    </w:p>
+    <w:p>
+      <w:pPr>
+        <w:numPr>
+          <w:ilvl w:val="0"/>
+          <w:numId w:val="1"/>
+        </w:numPr>
+        <w:spacing w:before="0" w:after="0" w:line="220" w:lineRule="auto"/>
+        <w:ind w:left="360" w:hanging="216"/>
+      </w:pPr>
+      <w:r>
+        <w:rPr>
+          <w:rFonts w:ascii="Calibri" w:hAnsi="Calibri" w:cs="Calibri"/>
+          <w:sz w:val="21"/>
+          <w:szCs w:val="21"/>
+        </w:rPr>
+        <w:t xml:space="preserve">Shipped a </w:t>
+      </w:r>
+      <w:r>
+        <w:rPr>
+          <w:rFonts w:ascii="Calibri" w:hAnsi="Calibri" w:cs="Calibri"/>
+          <w:b/>
+          <w:bCs/>
+          <w:sz w:val="21"/>
+          <w:szCs w:val="21"/>
+        </w:rPr>
+        <w:t xml:space="preserve">scalable, data-driven content system</w:t>
+      </w:r>
+      <w:r>
+        <w:rPr>
+          <w:rFonts w:ascii="Calibri" w:hAnsi="Calibri" w:cs="Calibri"/>
+          <w:sz w:val="21"/>
+          <w:szCs w:val="21"/>
+        </w:rPr>
+        <w:t xml:space="preserve"> with refined hi-fi interfaces and interactions</w:t>
       </w:r>
     </w:p>
     <w:p>
@@ -906,43 +1296,97 @@
           <w:sz w:val="21"/>
           <w:szCs w:val="21"/>
         </w:rPr>
-        <w:t xml:space="preserve">Redesigned Wikipedia's mobile experience across 5 sections (Home, Article, Search, Language, AI Chat) for how people read</w:t>
-      </w:r>
-    </w:p>
-    <w:p>
-      <w:pPr>
-        <w:numPr>
-          <w:ilvl w:val="0"/>
-          <w:numId w:val="1"/>
-        </w:numPr>
-        <w:spacing w:before="0" w:after="0" w:line="220" w:lineRule="auto"/>
-        <w:ind w:left="360" w:hanging="216"/>
-      </w:pPr>
-      <w:r>
-        <w:rPr>
-          <w:rFonts w:ascii="Calibri" w:hAnsi="Calibri" w:cs="Calibri"/>
-          <w:sz w:val="21"/>
-          <w:szCs w:val="21"/>
-        </w:rPr>
-        <w:t xml:space="preserve">Ran 3 structured interviews and a survey, synthesizing insights and How-Might-We framing into lo-fi wireframes</w:t>
-      </w:r>
-    </w:p>
-    <w:p>
-      <w:pPr>
-        <w:numPr>
-          <w:ilvl w:val="0"/>
-          <w:numId w:val="1"/>
-        </w:numPr>
-        <w:spacing w:before="0" w:after="0" w:line="220" w:lineRule="auto"/>
-        <w:ind w:left="360" w:hanging="216"/>
-      </w:pPr>
-      <w:r>
-        <w:rPr>
-          <w:rFonts w:ascii="Calibri" w:hAnsi="Calibri" w:cs="Calibri"/>
-          <w:sz w:val="21"/>
-          <w:szCs w:val="21"/>
-        </w:rPr>
-        <w:t xml:space="preserve">Usability-tested with 4 participants, folding findings (previews, search snippets, clearer AI framing) into the final prototype</w:t>
+        <w:t xml:space="preserve">Redesigned Wikipedia's mobile experience across </w:t>
+      </w:r>
+      <w:r>
+        <w:rPr>
+          <w:rFonts w:ascii="Calibri" w:hAnsi="Calibri" w:cs="Calibri"/>
+          <w:b/>
+          <w:bCs/>
+          <w:sz w:val="21"/>
+          <w:szCs w:val="21"/>
+        </w:rPr>
+        <w:t xml:space="preserve">5 sections</w:t>
+      </w:r>
+      <w:r>
+        <w:rPr>
+          <w:rFonts w:ascii="Calibri" w:hAnsi="Calibri" w:cs="Calibri"/>
+          <w:sz w:val="21"/>
+          <w:szCs w:val="21"/>
+        </w:rPr>
+        <w:t xml:space="preserve"> (Home, Article, Search, Language, AI Chat) for how people read</w:t>
+      </w:r>
+    </w:p>
+    <w:p>
+      <w:pPr>
+        <w:numPr>
+          <w:ilvl w:val="0"/>
+          <w:numId w:val="1"/>
+        </w:numPr>
+        <w:spacing w:before="0" w:after="0" w:line="220" w:lineRule="auto"/>
+        <w:ind w:left="360" w:hanging="216"/>
+      </w:pPr>
+      <w:r>
+        <w:rPr>
+          <w:rFonts w:ascii="Calibri" w:hAnsi="Calibri" w:cs="Calibri"/>
+          <w:sz w:val="21"/>
+          <w:szCs w:val="21"/>
+        </w:rPr>
+        <w:t xml:space="preserve">Ran </w:t>
+      </w:r>
+      <w:r>
+        <w:rPr>
+          <w:rFonts w:ascii="Calibri" w:hAnsi="Calibri" w:cs="Calibri"/>
+          <w:b/>
+          <w:bCs/>
+          <w:sz w:val="21"/>
+          <w:szCs w:val="21"/>
+        </w:rPr>
+        <w:t xml:space="preserve">3 structured interviews and a survey</w:t>
+      </w:r>
+      <w:r>
+        <w:rPr>
+          <w:rFonts w:ascii="Calibri" w:hAnsi="Calibri" w:cs="Calibri"/>
+          <w:sz w:val="21"/>
+          <w:szCs w:val="21"/>
+        </w:rPr>
+        <w:t xml:space="preserve">, synthesizing insights and How-Might-We framing into lo-fi wireframes</w:t>
+      </w:r>
+    </w:p>
+    <w:p>
+      <w:pPr>
+        <w:numPr>
+          <w:ilvl w:val="0"/>
+          <w:numId w:val="1"/>
+        </w:numPr>
+        <w:spacing w:before="0" w:after="0" w:line="220" w:lineRule="auto"/>
+        <w:ind w:left="360" w:hanging="216"/>
+      </w:pPr>
+      <w:r>
+        <w:rPr>
+          <w:rFonts w:ascii="Calibri" w:hAnsi="Calibri" w:cs="Calibri"/>
+          <w:sz w:val="21"/>
+          <w:szCs w:val="21"/>
+        </w:rPr>
+        <w:t xml:space="preserve">Usability-tested with </w:t>
+      </w:r>
+      <w:r>
+        <w:rPr>
+          <w:rFonts w:ascii="Calibri" w:hAnsi="Calibri" w:cs="Calibri"/>
+          <w:b/>
+          <w:bCs/>
+          <w:sz w:val="21"/>
+          <w:szCs w:val="21"/>
+        </w:rPr>
+        <w:t xml:space="preserve">4 participants</w:t>
+      </w:r>
+      <w:r>
+        <w:rPr>
+          <w:rFonts w:ascii="Calibri" w:hAnsi="Calibri" w:cs="Calibri"/>
+          <w:sz w:val="21"/>
+          <w:szCs w:val="21"/>
+        </w:rPr>
+        <w:t xml:space="preserve">, folding findings (previews, search snippets, clearer AI framing) into the final prototype</w:t>
       </w:r>
     </w:p>
     <w:p>

</xml_diff>

<commit_message>
resume: drop '(Red Team)' + 'multi-agent review' phrase; italicize dates/locations
</commit_message>
<xml_diff>
--- a/apps/resume/dist/Brian_Lee_Resume_Design.docx
+++ b/apps/resume/dist/Brian_Lee_Resume_Design.docx
@@ -211,6 +211,8 @@
       <w:r>
         <w:rPr>
           <w:rFonts w:ascii="Calibri" w:hAnsi="Calibri" w:cs="Calibri"/>
+          <w:i/>
+          <w:iCs/>
           <w:sz w:val="20"/>
           <w:szCs w:val="20"/>
         </w:rPr>
@@ -400,6 +402,8 @@
       <w:r>
         <w:rPr>
           <w:rFonts w:ascii="Calibri" w:hAnsi="Calibri" w:cs="Calibri"/>
+          <w:i/>
+          <w:iCs/>
           <w:sz w:val="20"/>
           <w:szCs w:val="20"/>
         </w:rPr>
@@ -538,11 +542,13 @@
           <w:sz w:val="21"/>
           <w:szCs w:val="21"/>
         </w:rPr>
-        <w:t xml:space="preserve">, Penn Spark (Red Team)</w:t>
-      </w:r>
-      <w:r>
-        <w:rPr>
-          <w:rFonts w:ascii="Calibri" w:hAnsi="Calibri" w:cs="Calibri"/>
+        <w:t xml:space="preserve">, Penn Spark</w:t>
+      </w:r>
+      <w:r>
+        <w:rPr>
+          <w:rFonts w:ascii="Calibri" w:hAnsi="Calibri" w:cs="Calibri"/>
+          <w:i/>
+          <w:iCs/>
           <w:sz w:val="20"/>
           <w:szCs w:val="20"/>
         </w:rPr>
@@ -696,6 +702,8 @@
       <w:r>
         <w:rPr>
           <w:rFonts w:ascii="Calibri" w:hAnsi="Calibri" w:cs="Calibri"/>
+          <w:i/>
+          <w:iCs/>
           <w:sz w:val="20"/>
           <w:szCs w:val="20"/>
         </w:rPr>
@@ -803,6 +811,8 @@
       <w:r>
         <w:rPr>
           <w:rFonts w:ascii="Calibri" w:hAnsi="Calibri" w:cs="Calibri"/>
+          <w:i/>
+          <w:iCs/>
           <w:sz w:val="20"/>
           <w:szCs w:val="20"/>
         </w:rPr>

</xml_diff>

<commit_message>
resume: 5 tailored variants (Software Engineer / Computer Graphics / Game / AI / Design) — Passenger back on Graphics+Game, AI leads with agent work + CareerOS project; variant factory + reusable project/skill pieces
</commit_message>
<xml_diff>
--- a/apps/resume/dist/Brian_Lee_Resume_Design.docx
+++ b/apps/resume/dist/Brian_Lee_Resume_Design.docx
@@ -986,6 +986,8 @@
       <w:r>
         <w:rPr>
           <w:rFonts w:ascii="Calibri" w:hAnsi="Calibri" w:cs="Calibri"/>
+          <w:i/>
+          <w:iCs/>
           <w:sz w:val="21"/>
           <w:szCs w:val="21"/>
         </w:rPr>
@@ -1131,6 +1133,8 @@
       <w:r>
         <w:rPr>
           <w:rFonts w:ascii="Calibri" w:hAnsi="Calibri" w:cs="Calibri"/>
+          <w:i/>
+          <w:iCs/>
           <w:sz w:val="21"/>
           <w:szCs w:val="21"/>
         </w:rPr>
@@ -1284,6 +1288,8 @@
       <w:r>
         <w:rPr>
           <w:rFonts w:ascii="Calibri" w:hAnsi="Calibri" w:cs="Calibri"/>
+          <w:i/>
+          <w:iCs/>
           <w:sz w:val="21"/>
           <w:szCs w:val="21"/>
         </w:rPr>

</xml_diff>

<commit_message>
resume: pack the Design variant (Gatsby->Next.js rebuild + Wiki persona/IA)
Design was the last loose variant (0.72in). Added accurate content from the
site: Penn Spark's Gatsby->Next.js rebuild (a real technical signal that was
missing) and Wikipedia's 3-persona research + IA bullet. All 5 variants now
pack to ~0.21-0.27in bottom margin.

Co-Authored-By: Claude Opus 4.8 <noreply@anthropic.com>
</commit_message>
<xml_diff>
--- a/apps/resume/dist/Brian_Lee_Resume_Design.docx
+++ b/apps/resume/dist/Brian_Lee_Resume_Design.docx
@@ -1140,6 +1140,42 @@
           <w:sz w:val="21"/>
           <w:szCs w:val="21"/>
         </w:rPr>
+        <w:t xml:space="preserve">Rebuilt the site from an aging </w:t>
+      </w:r>
+      <w:r>
+        <w:rPr>
+          <w:rFonts w:ascii="Calibri" w:hAnsi="Calibri" w:cs="Calibri"/>
+          <w:b/>
+          <w:bCs/>
+          <w:sz w:val="21"/>
+          <w:szCs w:val="21"/>
+        </w:rPr>
+        <w:t xml:space="preserve">Gatsby stack to Next.js + React</w:t>
+      </w:r>
+      <w:r>
+        <w:rPr>
+          <w:rFonts w:ascii="Calibri" w:hAnsi="Calibri" w:cs="Calibri"/>
+          <w:sz w:val="21"/>
+          <w:szCs w:val="21"/>
+        </w:rPr>
+        <w:t xml:space="preserve">, shipping it live at pennspark.org</w:t>
+      </w:r>
+    </w:p>
+    <w:p>
+      <w:pPr>
+        <w:numPr>
+          <w:ilvl w:val="0"/>
+          <w:numId w:val="1"/>
+        </w:numPr>
+        <w:spacing w:before="0" w:after="0" w:line="214" w:lineRule="auto"/>
+        <w:ind w:left="360" w:hanging="216"/>
+      </w:pPr>
+      <w:r>
+        <w:rPr>
+          <w:rFonts w:ascii="Calibri" w:hAnsi="Calibri" w:cs="Calibri"/>
+          <w:sz w:val="21"/>
+          <w:szCs w:val="21"/>
+        </w:rPr>
         <w:t xml:space="preserve">Shipped a </w:t>
       </w:r>
       <w:r>
@@ -1259,25 +1295,61 @@
           <w:sz w:val="21"/>
           <w:szCs w:val="21"/>
         </w:rPr>
-        <w:t xml:space="preserve">Ran </w:t>
-      </w:r>
-      <w:r>
-        <w:rPr>
-          <w:rFonts w:ascii="Calibri" w:hAnsi="Calibri" w:cs="Calibri"/>
-          <w:b/>
-          <w:bCs/>
-          <w:sz w:val="21"/>
-          <w:szCs w:val="21"/>
-        </w:rPr>
-        <w:t xml:space="preserve">3 structured interviews and a survey</w:t>
-      </w:r>
-      <w:r>
-        <w:rPr>
-          <w:rFonts w:ascii="Calibri" w:hAnsi="Calibri" w:cs="Calibri"/>
-          <w:sz w:val="21"/>
-          <w:szCs w:val="21"/>
-        </w:rPr>
-        <w:t xml:space="preserve">, synthesizing insights and How-Might-We framing into lo-fi wireframes</w:t>
+        <w:t xml:space="preserve">Grounded the work in </w:t>
+      </w:r>
+      <w:r>
+        <w:rPr>
+          <w:rFonts w:ascii="Calibri" w:hAnsi="Calibri" w:cs="Calibri"/>
+          <w:b/>
+          <w:bCs/>
+          <w:sz w:val="21"/>
+          <w:szCs w:val="21"/>
+        </w:rPr>
+        <w:t xml:space="preserve">3 distinct reader personas</w:t>
+      </w:r>
+      <w:r>
+        <w:rPr>
+          <w:rFonts w:ascii="Calibri" w:hAnsi="Calibri" w:cs="Calibri"/>
+          <w:sz w:val="21"/>
+          <w:szCs w:val="21"/>
+        </w:rPr>
+        <w:t xml:space="preserve"> (quick-fact, deep-read, language-switching) from structured interviews and a survey</w:t>
+      </w:r>
+    </w:p>
+    <w:p>
+      <w:pPr>
+        <w:numPr>
+          <w:ilvl w:val="0"/>
+          <w:numId w:val="1"/>
+        </w:numPr>
+        <w:spacing w:before="0" w:after="0" w:line="214" w:lineRule="auto"/>
+        <w:ind w:left="360" w:hanging="216"/>
+      </w:pPr>
+      <w:r>
+        <w:rPr>
+          <w:rFonts w:ascii="Calibri" w:hAnsi="Calibri" w:cs="Calibri"/>
+          <w:sz w:val="21"/>
+          <w:szCs w:val="21"/>
+        </w:rPr>
+        <w:t xml:space="preserve">Set the </w:t>
+      </w:r>
+      <w:r>
+        <w:rPr>
+          <w:rFonts w:ascii="Calibri" w:hAnsi="Calibri" w:cs="Calibri"/>
+          <w:b/>
+          <w:bCs/>
+          <w:sz w:val="21"/>
+          <w:szCs w:val="21"/>
+        </w:rPr>
+        <w:t xml:space="preserve">information architecture</w:t>
+      </w:r>
+      <w:r>
+        <w:rPr>
+          <w:rFonts w:ascii="Calibri" w:hAnsi="Calibri" w:cs="Calibri"/>
+          <w:sz w:val="21"/>
+          <w:szCs w:val="21"/>
+        </w:rPr>
+        <w:t xml:space="preserve"> with lo-fi wireframes, then refined it through How-Might-We framing</w:t>
       </w:r>
     </w:p>
     <w:p>

</xml_diff>